<commit_message>
Actualizado la declaración uso IA
</commit_message>
<xml_diff>
--- a/Docs/Tercera semana/word/Declaracion_uso_IA_PGPI_v1.1_2026-10-14.docx
+++ b/Docs/Tercera semana/word/Declaracion_uso_IA_PGPI_v1.1_2026-10-14.docx
@@ -4,7 +4,7 @@
   <w:body>
     <w:p>
       <w:pPr>
-        <w:pStyle w:val="Ttulo"/>
+        <w:pStyle w:val="Title"/>
         <w:rPr>
           <w:lang w:val="es-ES"/>
         </w:rPr>
@@ -74,12 +74,14 @@
         </w:rPr>
         <w:t xml:space="preserve">Proyecto: </w:t>
       </w:r>
+      <w:proofErr w:type="spellStart"/>
       <w:r>
         <w:rPr>
           <w:lang w:val="es-ES"/>
         </w:rPr>
         <w:t>TuSuper</w:t>
       </w:r>
+      <w:proofErr w:type="spellEnd"/>
     </w:p>
     <w:p>
       <w:pPr>
@@ -122,7 +124,7 @@
     </w:p>
     <w:p>
       <w:pPr>
-        <w:pStyle w:val="Ttulo2"/>
+        <w:pStyle w:val="Heading2"/>
         <w:rPr>
           <w:lang w:val="es-ES"/>
         </w:rPr>
@@ -162,11 +164,16 @@
     </w:p>
     <w:p>
       <w:pPr>
-        <w:pStyle w:val="Ttulo2"/>
+        <w:pStyle w:val="Heading2"/>
       </w:pPr>
       <w:r>
-        <w:t>Registro de usos</w:t>
+        <w:t xml:space="preserve">Registro de </w:t>
       </w:r>
+      <w:proofErr w:type="spellStart"/>
+      <w:r>
+        <w:t>usos</w:t>
+      </w:r>
+      <w:proofErr w:type="spellEnd"/>
     </w:p>
     <w:tbl>
       <w:tblPr>
@@ -209,12 +216,21 @@
             <w:pPr>
               <w:spacing w:before="60" w:after="60"/>
             </w:pPr>
+            <w:proofErr w:type="spellStart"/>
             <w:r>
               <w:rPr>
                 <w:b/>
                 <w:sz w:val="18"/>
               </w:rPr>
-              <w:t>Fecha e ID</w:t>
+              <w:t>Fecha</w:t>
+            </w:r>
+            <w:proofErr w:type="spellEnd"/>
+            <w:r>
+              <w:rPr>
+                <w:b/>
+                <w:sz w:val="18"/>
+              </w:rPr>
+              <w:t xml:space="preserve"> e ID</w:t>
             </w:r>
           </w:p>
         </w:tc>
@@ -240,13 +256,31 @@
             <w:pPr>
               <w:spacing w:before="60" w:after="60"/>
             </w:pPr>
+            <w:proofErr w:type="spellStart"/>
             <w:r>
               <w:rPr>
                 <w:b/>
                 <w:sz w:val="18"/>
               </w:rPr>
-              <w:t>Herramienta empleada</w:t>
+              <w:t>Herramienta</w:t>
             </w:r>
+            <w:proofErr w:type="spellEnd"/>
+            <w:r>
+              <w:rPr>
+                <w:b/>
+                <w:sz w:val="18"/>
+              </w:rPr>
+              <w:t xml:space="preserve"> </w:t>
+            </w:r>
+            <w:proofErr w:type="spellStart"/>
+            <w:r>
+              <w:rPr>
+                <w:b/>
+                <w:sz w:val="18"/>
+              </w:rPr>
+              <w:t>empleada</w:t>
+            </w:r>
+            <w:proofErr w:type="spellEnd"/>
           </w:p>
         </w:tc>
         <w:tc>
@@ -271,13 +305,31 @@
             <w:pPr>
               <w:spacing w:before="60" w:after="60"/>
             </w:pPr>
+            <w:proofErr w:type="spellStart"/>
             <w:r>
               <w:rPr>
                 <w:b/>
                 <w:sz w:val="18"/>
               </w:rPr>
-              <w:t>Documento y tarea</w:t>
+              <w:t>Documento</w:t>
             </w:r>
+            <w:proofErr w:type="spellEnd"/>
+            <w:r>
+              <w:rPr>
+                <w:b/>
+                <w:sz w:val="18"/>
+              </w:rPr>
+              <w:t xml:space="preserve"> y </w:t>
+            </w:r>
+            <w:proofErr w:type="spellStart"/>
+            <w:r>
+              <w:rPr>
+                <w:b/>
+                <w:sz w:val="18"/>
+              </w:rPr>
+              <w:t>tarea</w:t>
+            </w:r>
+            <w:proofErr w:type="spellEnd"/>
           </w:p>
         </w:tc>
         <w:tc>
@@ -302,13 +354,31 @@
             <w:pPr>
               <w:spacing w:before="60" w:after="60"/>
             </w:pPr>
+            <w:proofErr w:type="spellStart"/>
             <w:r>
               <w:rPr>
                 <w:b/>
                 <w:sz w:val="18"/>
               </w:rPr>
-              <w:t>Qué se aceptó</w:t>
+              <w:t>Qué</w:t>
             </w:r>
+            <w:proofErr w:type="spellEnd"/>
+            <w:r>
+              <w:rPr>
+                <w:b/>
+                <w:sz w:val="18"/>
+              </w:rPr>
+              <w:t xml:space="preserve"> se </w:t>
+            </w:r>
+            <w:proofErr w:type="spellStart"/>
+            <w:r>
+              <w:rPr>
+                <w:b/>
+                <w:sz w:val="18"/>
+              </w:rPr>
+              <w:t>aceptó</w:t>
+            </w:r>
+            <w:proofErr w:type="spellEnd"/>
           </w:p>
         </w:tc>
         <w:tc>
@@ -368,13 +438,31 @@
             <w:pPr>
               <w:spacing w:before="60" w:after="60"/>
             </w:pPr>
+            <w:proofErr w:type="spellStart"/>
             <w:r>
               <w:rPr>
                 <w:b/>
                 <w:sz w:val="18"/>
               </w:rPr>
-              <w:t>Quién lo verificó</w:t>
+              <w:t>Quién</w:t>
             </w:r>
+            <w:proofErr w:type="spellEnd"/>
+            <w:r>
+              <w:rPr>
+                <w:b/>
+                <w:sz w:val="18"/>
+              </w:rPr>
+              <w:t xml:space="preserve"> lo </w:t>
+            </w:r>
+            <w:proofErr w:type="spellStart"/>
+            <w:r>
+              <w:rPr>
+                <w:b/>
+                <w:sz w:val="18"/>
+              </w:rPr>
+              <w:t>verificó</w:t>
+            </w:r>
+            <w:proofErr w:type="spellEnd"/>
           </w:p>
         </w:tc>
       </w:tr>
@@ -447,12 +535,21 @@
                 <w:lang w:val="es-ES"/>
               </w:rPr>
             </w:pPr>
+            <w:proofErr w:type="spellStart"/>
             <w:r>
               <w:rPr>
                 <w:sz w:val="18"/>
                 <w:lang w:val="es-ES"/>
               </w:rPr>
-              <w:t>ChatGPT v5.6</w:t>
+              <w:t>ChatGPT</w:t>
+            </w:r>
+            <w:proofErr w:type="spellEnd"/>
+            <w:r>
+              <w:rPr>
+                <w:sz w:val="18"/>
+                <w:lang w:val="es-ES"/>
+              </w:rPr>
+              <w:t xml:space="preserve"> v5.6</w:t>
             </w:r>
           </w:p>
         </w:tc>
@@ -1027,7 +1124,23 @@
                 <w:lang w:val="es-ES"/>
               </w:rPr>
               <w:br/>
-              <w:t>Revisión y finalización de la decisión D-03 sobre la consulta al patrocinador de las fechas de cierre comercial de TuSuper.</w:t>
+              <w:t xml:space="preserve">Revisión y finalización de la decisión D-03 sobre la consulta al patrocinador de las fechas de cierre comercial de </w:t>
+            </w:r>
+            <w:proofErr w:type="spellStart"/>
+            <w:r>
+              <w:rPr>
+                <w:sz w:val="18"/>
+                <w:lang w:val="es-ES"/>
+              </w:rPr>
+              <w:t>TuSuper</w:t>
+            </w:r>
+            <w:proofErr w:type="spellEnd"/>
+            <w:r>
+              <w:rPr>
+                <w:sz w:val="18"/>
+                <w:lang w:val="es-ES"/>
+              </w:rPr>
+              <w:t>.</w:t>
             </w:r>
           </w:p>
         </w:tc>
@@ -1061,11 +1174,33 @@
               </w:rPr>
               <w:t xml:space="preserve">Redacción de la D-03: decisión de consultar al patrocinador mediante F-CO-02, alternativa descartada, justificación, documentos afectados y vigencia. </w:t>
             </w:r>
+            <w:proofErr w:type="spellStart"/>
             <w:r>
               <w:rPr>
                 <w:sz w:val="18"/>
               </w:rPr>
-              <w:t>Actualización de la cabecera y del histórico de cambios.</w:t>
+              <w:t>Actualización</w:t>
+            </w:r>
+            <w:proofErr w:type="spellEnd"/>
+            <w:r>
+              <w:rPr>
+                <w:sz w:val="18"/>
+              </w:rPr>
+              <w:t xml:space="preserve"> de la cabecera y del histórico de </w:t>
+            </w:r>
+            <w:proofErr w:type="spellStart"/>
+            <w:r>
+              <w:rPr>
+                <w:sz w:val="18"/>
+              </w:rPr>
+              <w:t>cambios</w:t>
+            </w:r>
+            <w:proofErr w:type="spellEnd"/>
+            <w:r>
+              <w:rPr>
+                <w:sz w:val="18"/>
+              </w:rPr>
+              <w:t>.</w:t>
             </w:r>
           </w:p>
         </w:tc>
@@ -1136,10 +1271,225 @@
           </w:p>
         </w:tc>
       </w:tr>
+      <w:tr>
+        <w:trPr>
+          <w:cantSplit/>
+        </w:trPr>
+        <w:tc>
+          <w:tcPr>
+            <w:tcW w:w="936" w:type="dxa"/>
+            <w:tcBorders>
+              <w:top w:val="single" w:sz="4" w:space="0" w:color="D9D9D9"/>
+              <w:left w:val="single" w:sz="4" w:space="0" w:color="D9D9D9"/>
+              <w:bottom w:val="single" w:sz="4" w:space="0" w:color="D9D9D9"/>
+              <w:right w:val="single" w:sz="4" w:space="0" w:color="D9D9D9"/>
+            </w:tcBorders>
+            <w:tcMar>
+              <w:top w:w="85" w:type="dxa"/>
+              <w:left w:w="85" w:type="dxa"/>
+              <w:bottom w:w="85" w:type="dxa"/>
+              <w:right w:w="85" w:type="dxa"/>
+            </w:tcMar>
+            <w:vAlign w:val="center"/>
+          </w:tcPr>
+          <w:p>
+            <w:pPr>
+              <w:rPr>
+                <w:sz w:val="18"/>
+              </w:rPr>
+            </w:pPr>
+            <w:r>
+              <w:rPr>
+                <w:sz w:val="18"/>
+              </w:rPr>
+              <w:t>IA-004</w:t>
+            </w:r>
+          </w:p>
+        </w:tc>
+        <w:tc>
+          <w:tcPr>
+            <w:tcW w:w="1440" w:type="dxa"/>
+            <w:tcBorders>
+              <w:top w:val="single" w:sz="4" w:space="0" w:color="D9D9D9"/>
+              <w:left w:val="single" w:sz="4" w:space="0" w:color="D9D9D9"/>
+              <w:bottom w:val="single" w:sz="4" w:space="0" w:color="D9D9D9"/>
+              <w:right w:val="single" w:sz="4" w:space="0" w:color="D9D9D9"/>
+            </w:tcBorders>
+            <w:tcMar>
+              <w:top w:w="85" w:type="dxa"/>
+              <w:left w:w="85" w:type="dxa"/>
+              <w:bottom w:w="85" w:type="dxa"/>
+              <w:right w:w="85" w:type="dxa"/>
+            </w:tcMar>
+            <w:vAlign w:val="center"/>
+          </w:tcPr>
+          <w:p>
+            <w:pPr>
+              <w:rPr>
+                <w:sz w:val="18"/>
+              </w:rPr>
+            </w:pPr>
+            <w:r>
+              <w:rPr>
+                <w:sz w:val="18"/>
+              </w:rPr>
+              <w:t>Copilot MS365</w:t>
+            </w:r>
+          </w:p>
+        </w:tc>
+        <w:tc>
+          <w:tcPr>
+            <w:tcW w:w="2088" w:type="dxa"/>
+            <w:tcBorders>
+              <w:top w:val="single" w:sz="4" w:space="0" w:color="D9D9D9"/>
+              <w:left w:val="single" w:sz="4" w:space="0" w:color="D9D9D9"/>
+              <w:bottom w:val="single" w:sz="4" w:space="0" w:color="D9D9D9"/>
+              <w:right w:val="single" w:sz="4" w:space="0" w:color="D9D9D9"/>
+            </w:tcBorders>
+            <w:tcMar>
+              <w:top w:w="85" w:type="dxa"/>
+              <w:left w:w="85" w:type="dxa"/>
+              <w:bottom w:w="85" w:type="dxa"/>
+              <w:right w:w="85" w:type="dxa"/>
+            </w:tcMar>
+            <w:vAlign w:val="center"/>
+          </w:tcPr>
+          <w:p>
+            <w:pPr>
+              <w:rPr>
+                <w:sz w:val="18"/>
+                <w:lang w:val="es-ES"/>
+              </w:rPr>
+            </w:pPr>
+            <w:r>
+              <w:rPr>
+                <w:sz w:val="18"/>
+                <w:lang w:val="es-ES"/>
+              </w:rPr>
+              <w:t>EDT_v1.0_2026-10-17.docx</w:t>
+            </w:r>
+          </w:p>
+        </w:tc>
+        <w:tc>
+          <w:tcPr>
+            <w:tcW w:w="1728" w:type="dxa"/>
+            <w:tcBorders>
+              <w:top w:val="single" w:sz="4" w:space="0" w:color="D9D9D9"/>
+              <w:left w:val="single" w:sz="4" w:space="0" w:color="D9D9D9"/>
+              <w:bottom w:val="single" w:sz="4" w:space="0" w:color="D9D9D9"/>
+              <w:right w:val="single" w:sz="4" w:space="0" w:color="D9D9D9"/>
+            </w:tcBorders>
+            <w:tcMar>
+              <w:top w:w="85" w:type="dxa"/>
+              <w:left w:w="85" w:type="dxa"/>
+              <w:bottom w:w="85" w:type="dxa"/>
+              <w:right w:w="85" w:type="dxa"/>
+            </w:tcMar>
+            <w:vAlign w:val="center"/>
+          </w:tcPr>
+          <w:p>
+            <w:pPr>
+              <w:rPr>
+                <w:sz w:val="18"/>
+                <w:lang w:val="es-ES"/>
+              </w:rPr>
+            </w:pPr>
+            <w:r>
+              <w:rPr>
+                <w:sz w:val="18"/>
+                <w:lang w:val="es-ES"/>
+              </w:rPr>
+              <w:t>Se aceptó la propuesta de EDT tras varias iteraciones</w:t>
+            </w:r>
+          </w:p>
+        </w:tc>
+        <w:tc>
+          <w:tcPr>
+            <w:tcW w:w="2592" w:type="dxa"/>
+            <w:tcBorders>
+              <w:top w:val="single" w:sz="4" w:space="0" w:color="D9D9D9"/>
+              <w:left w:val="single" w:sz="4" w:space="0" w:color="D9D9D9"/>
+              <w:bottom w:val="single" w:sz="4" w:space="0" w:color="D9D9D9"/>
+              <w:right w:val="single" w:sz="4" w:space="0" w:color="D9D9D9"/>
+            </w:tcBorders>
+            <w:tcMar>
+              <w:top w:w="85" w:type="dxa"/>
+              <w:left w:w="85" w:type="dxa"/>
+              <w:bottom w:w="85" w:type="dxa"/>
+              <w:right w:w="85" w:type="dxa"/>
+            </w:tcMar>
+            <w:vAlign w:val="center"/>
+          </w:tcPr>
+          <w:p>
+            <w:pPr>
+              <w:rPr>
+                <w:sz w:val="18"/>
+                <w:lang w:val="es-ES"/>
+              </w:rPr>
+            </w:pPr>
+            <w:proofErr w:type="gramStart"/>
+            <w:r>
+              <w:rPr>
+                <w:sz w:val="18"/>
+                <w:lang w:val="es-ES"/>
+              </w:rPr>
+              <w:t>Las primeras iteraciones no cumplía</w:t>
+            </w:r>
+            <w:proofErr w:type="gramEnd"/>
+            <w:r>
+              <w:rPr>
+                <w:sz w:val="18"/>
+                <w:lang w:val="es-ES"/>
+              </w:rPr>
+              <w:t xml:space="preserve"> con el plan de gestión de alcance y generó un nivel </w:t>
+            </w:r>
+            <w:r>
+              <w:rPr>
+                <w:sz w:val="18"/>
+                <w:lang w:val="es-ES"/>
+              </w:rPr>
+              <w:t>erróneo</w:t>
+            </w:r>
+          </w:p>
+        </w:tc>
+        <w:tc>
+          <w:tcPr>
+            <w:tcW w:w="1584" w:type="dxa"/>
+            <w:tcBorders>
+              <w:top w:val="single" w:sz="4" w:space="0" w:color="D9D9D9"/>
+              <w:left w:val="single" w:sz="4" w:space="0" w:color="D9D9D9"/>
+              <w:bottom w:val="single" w:sz="4" w:space="0" w:color="D9D9D9"/>
+              <w:right w:val="single" w:sz="4" w:space="0" w:color="D9D9D9"/>
+            </w:tcBorders>
+            <w:tcMar>
+              <w:top w:w="85" w:type="dxa"/>
+              <w:left w:w="85" w:type="dxa"/>
+              <w:bottom w:w="85" w:type="dxa"/>
+              <w:right w:w="85" w:type="dxa"/>
+            </w:tcMar>
+            <w:vAlign w:val="center"/>
+          </w:tcPr>
+          <w:p>
+            <w:pPr>
+              <w:rPr>
+                <w:sz w:val="18"/>
+                <w:lang w:val="es-ES"/>
+              </w:rPr>
+            </w:pPr>
+            <w:r>
+              <w:rPr>
+                <w:sz w:val="18"/>
+                <w:lang w:val="es-ES"/>
+              </w:rPr>
+              <w:t>Francisco José Pérez Jiménez</w:t>
+            </w:r>
+          </w:p>
+        </w:tc>
+      </w:tr>
     </w:tbl>
     <w:p>
       <w:pPr>
-        <w:pStyle w:val="Ttulo2"/>
+        <w:pStyle w:val="Heading2"/>
         <w:rPr>
           <w:lang w:val="es-ES"/>
         </w:rPr>
@@ -1273,7 +1623,7 @@
 <w:ftr xmlns:wpc="http://schemas.microsoft.com/office/word/2010/wordprocessingCanvas" xmlns:cx="http://schemas.microsoft.com/office/drawing/2014/chartex" xmlns:cx1="http://schemas.microsoft.com/office/drawing/2015/9/8/chartex" xmlns:cx2="http://schemas.microsoft.com/office/drawing/2015/10/21/chartex" xmlns:cx3="http://schemas.microsoft.com/office/drawing/2016/5/9/chartex" xmlns:cx4="http://schemas.microsoft.com/office/drawing/2016/5/10/chartex" xmlns:cx5="http://schemas.microsoft.com/office/drawing/2016/5/11/chartex" xmlns:cx6="http://schemas.microsoft.com/office/drawing/2016/5/12/chartex" xmlns:cx7="http://schemas.microsoft.com/office/drawing/2016/5/13/chartex" xmlns:cx8="http://schemas.microsoft.com/office/drawing/2016/5/14/chartex" xmlns:mc="http://schemas.openxmlformats.org/markup-compatibility/2006" xmlns:aink="http://schemas.microsoft.com/office/drawing/2016/ink" xmlns:am3d="http://schemas.microsoft.com/office/drawing/2017/model3d" xmlns:o="urn:schemas-microsoft-com:office:office" xmlns:oel="http://schemas.microsoft.com/office/2019/extlst" xmlns:r="http://schemas.openxmlformats.org/officeDocument/2006/relationships" xmlns:m="http://schemas.openxmlformats.org/officeDocument/2006/math" xmlns:v="urn:schemas-microsoft-com:vml" xmlns:wp14="http://schemas.microsoft.com/office/word/2010/wordprocessingDrawing" xmlns:wp="http://schemas.openxmlformats.org/drawingml/2006/wordprocessingDrawing" xmlns:w10="urn:schemas-microsoft-com:office:word" xmlns:w="http://schemas.openxmlformats.org/wordprocessingml/2006/main" xmlns:w14="http://schemas.microsoft.com/office/word/2010/wordml" xmlns:w15="http://schemas.microsoft.com/office/word/2012/wordml" xmlns:w16cex="http://schemas.microsoft.com/office/word/2018/wordml/cex" xmlns:w16cid="http://schemas.microsoft.com/office/word/2016/wordml/cid" xmlns:w16="http://schemas.microsoft.com/office/word/2018/wordml" xmlns:w16du="http://schemas.microsoft.com/office/word/2023/wordml/word16du" xmlns:w16sdtdh="http://schemas.microsoft.com/office/word/2020/wordml/sdtdatahash" xmlns:w16sdtfl="http://schemas.microsoft.com/office/word/2024/wordml/sdtformatlock" xmlns:w16se="http://schemas.microsoft.com/office/word/2015/wordml/symex" xmlns:wpg="http://schemas.microsoft.com/office/word/2010/wordprocessingGroup" xmlns:wpi="http://schemas.microsoft.com/office/word/2010/wordprocessingInk" xmlns:wne="http://schemas.microsoft.com/office/word/2006/wordml" xmlns:wps="http://schemas.microsoft.com/office/word/2010/wordprocessingShape" mc:Ignorable="w14 w15 w16se w16cid w16 w16cex w16sdtdh w16sdtfl w16du wp14">
   <w:p>
     <w:pPr>
-      <w:pStyle w:val="Piedepgina"/>
+      <w:pStyle w:val="Footer"/>
       <w:rPr>
         <w:lang w:val="es-ES"/>
       </w:rPr>
@@ -1357,7 +1707,7 @@
     <w:lvl w:ilvl="0">
       <w:start w:val="1"/>
       <w:numFmt w:val="decimal"/>
-      <w:pStyle w:val="Listaconnmeros3"/>
+      <w:pStyle w:val="ListNumber3"/>
       <w:lvlText w:val="%1."/>
       <w:lvlJc w:val="left"/>
       <w:pPr>
@@ -1375,7 +1725,7 @@
     <w:lvl w:ilvl="0">
       <w:start w:val="1"/>
       <w:numFmt w:val="decimal"/>
-      <w:pStyle w:val="Listaconnmeros2"/>
+      <w:pStyle w:val="ListNumber2"/>
       <w:lvlText w:val="%1."/>
       <w:lvlJc w:val="left"/>
       <w:pPr>
@@ -1413,7 +1763,7 @@
     <w:lvl w:ilvl="0">
       <w:start w:val="1"/>
       <w:numFmt w:val="bullet"/>
-      <w:pStyle w:val="Listaconvietas3"/>
+      <w:pStyle w:val="ListBullet3"/>
       <w:lvlText w:val=""/>
       <w:lvlJc w:val="left"/>
       <w:pPr>
@@ -1434,7 +1784,7 @@
     <w:lvl w:ilvl="0">
       <w:start w:val="1"/>
       <w:numFmt w:val="bullet"/>
-      <w:pStyle w:val="Listaconvietas2"/>
+      <w:pStyle w:val="ListBullet2"/>
       <w:lvlText w:val=""/>
       <w:lvlJc w:val="left"/>
       <w:pPr>
@@ -1455,7 +1805,7 @@
     <w:lvl w:ilvl="0">
       <w:start w:val="1"/>
       <w:numFmt w:val="decimal"/>
-      <w:pStyle w:val="Listaconnmeros"/>
+      <w:pStyle w:val="ListNumber"/>
       <w:lvlText w:val="%1."/>
       <w:lvlJc w:val="left"/>
       <w:pPr>
@@ -1473,7 +1823,7 @@
     <w:lvl w:ilvl="0">
       <w:start w:val="1"/>
       <w:numFmt w:val="bullet"/>
-      <w:pStyle w:val="Listaconvietas"/>
+      <w:pStyle w:val="ListBullet"/>
       <w:lvlText w:val=""/>
       <w:lvlJc w:val="left"/>
       <w:pPr>
@@ -1916,11 +2266,11 @@
       <w:sz w:val="20"/>
     </w:rPr>
   </w:style>
-  <w:style w:type="paragraph" w:styleId="Ttulo1">
+  <w:style w:type="paragraph" w:styleId="Heading1">
     <w:name w:val="heading 1"/>
     <w:basedOn w:val="Normal"/>
     <w:next w:val="Normal"/>
-    <w:link w:val="Ttulo1Car"/>
+    <w:link w:val="Heading1Char"/>
     <w:uiPriority w:val="9"/>
     <w:qFormat/>
     <w:rsid w:val="00FC693F"/>
@@ -1938,11 +2288,11 @@
       <w:szCs w:val="28"/>
     </w:rPr>
   </w:style>
-  <w:style w:type="paragraph" w:styleId="Ttulo2">
+  <w:style w:type="paragraph" w:styleId="Heading2">
     <w:name w:val="heading 2"/>
     <w:basedOn w:val="Normal"/>
     <w:next w:val="Normal"/>
-    <w:link w:val="Ttulo2Car"/>
+    <w:link w:val="Heading2Char"/>
     <w:uiPriority w:val="9"/>
     <w:unhideWhenUsed/>
     <w:qFormat/>
@@ -1961,11 +2311,11 @@
       <w:szCs w:val="26"/>
     </w:rPr>
   </w:style>
-  <w:style w:type="paragraph" w:styleId="Ttulo3">
+  <w:style w:type="paragraph" w:styleId="Heading3">
     <w:name w:val="heading 3"/>
     <w:basedOn w:val="Normal"/>
     <w:next w:val="Normal"/>
-    <w:link w:val="Ttulo3Car"/>
+    <w:link w:val="Heading3Char"/>
     <w:uiPriority w:val="9"/>
     <w:unhideWhenUsed/>
     <w:qFormat/>
@@ -1983,11 +2333,11 @@
       <w:color w:val="4F81BD" w:themeColor="accent1"/>
     </w:rPr>
   </w:style>
-  <w:style w:type="paragraph" w:styleId="Ttulo4">
+  <w:style w:type="paragraph" w:styleId="Heading4">
     <w:name w:val="heading 4"/>
     <w:basedOn w:val="Normal"/>
     <w:next w:val="Normal"/>
-    <w:link w:val="Ttulo4Car"/>
+    <w:link w:val="Heading4Char"/>
     <w:uiPriority w:val="9"/>
     <w:semiHidden/>
     <w:unhideWhenUsed/>
@@ -2008,11 +2358,11 @@
       <w:color w:val="4F81BD" w:themeColor="accent1"/>
     </w:rPr>
   </w:style>
-  <w:style w:type="paragraph" w:styleId="Ttulo5">
+  <w:style w:type="paragraph" w:styleId="Heading5">
     <w:name w:val="heading 5"/>
     <w:basedOn w:val="Normal"/>
     <w:next w:val="Normal"/>
-    <w:link w:val="Ttulo5Car"/>
+    <w:link w:val="Heading5Char"/>
     <w:uiPriority w:val="9"/>
     <w:semiHidden/>
     <w:unhideWhenUsed/>
@@ -2029,11 +2379,11 @@
       <w:color w:val="243F60" w:themeColor="accent1" w:themeShade="7F"/>
     </w:rPr>
   </w:style>
-  <w:style w:type="paragraph" w:styleId="Ttulo6">
+  <w:style w:type="paragraph" w:styleId="Heading6">
     <w:name w:val="heading 6"/>
     <w:basedOn w:val="Normal"/>
     <w:next w:val="Normal"/>
-    <w:link w:val="Ttulo6Car"/>
+    <w:link w:val="Heading6Char"/>
     <w:uiPriority w:val="9"/>
     <w:semiHidden/>
     <w:unhideWhenUsed/>
@@ -2052,11 +2402,11 @@
       <w:color w:val="243F60" w:themeColor="accent1" w:themeShade="7F"/>
     </w:rPr>
   </w:style>
-  <w:style w:type="paragraph" w:styleId="Ttulo7">
+  <w:style w:type="paragraph" w:styleId="Heading7">
     <w:name w:val="heading 7"/>
     <w:basedOn w:val="Normal"/>
     <w:next w:val="Normal"/>
-    <w:link w:val="Ttulo7Car"/>
+    <w:link w:val="Heading7Char"/>
     <w:uiPriority w:val="9"/>
     <w:semiHidden/>
     <w:unhideWhenUsed/>
@@ -2075,11 +2425,11 @@
       <w:color w:val="404040" w:themeColor="text1" w:themeTint="BF"/>
     </w:rPr>
   </w:style>
-  <w:style w:type="paragraph" w:styleId="Ttulo8">
+  <w:style w:type="paragraph" w:styleId="Heading8">
     <w:name w:val="heading 8"/>
     <w:basedOn w:val="Normal"/>
     <w:next w:val="Normal"/>
-    <w:link w:val="Ttulo8Car"/>
+    <w:link w:val="Heading8Char"/>
     <w:uiPriority w:val="9"/>
     <w:semiHidden/>
     <w:unhideWhenUsed/>
@@ -2097,11 +2447,11 @@
       <w:szCs w:val="20"/>
     </w:rPr>
   </w:style>
-  <w:style w:type="paragraph" w:styleId="Ttulo9">
+  <w:style w:type="paragraph" w:styleId="Heading9">
     <w:name w:val="heading 9"/>
     <w:basedOn w:val="Normal"/>
     <w:next w:val="Normal"/>
-    <w:link w:val="Ttulo9Car"/>
+    <w:link w:val="Heading9Char"/>
     <w:uiPriority w:val="9"/>
     <w:semiHidden/>
     <w:unhideWhenUsed/>
@@ -2121,13 +2471,13 @@
       <w:szCs w:val="20"/>
     </w:rPr>
   </w:style>
-  <w:style w:type="character" w:default="1" w:styleId="Fuentedeprrafopredeter">
+  <w:style w:type="character" w:default="1" w:styleId="DefaultParagraphFont">
     <w:name w:val="Default Paragraph Font"/>
     <w:uiPriority w:val="1"/>
     <w:semiHidden/>
     <w:unhideWhenUsed/>
   </w:style>
-  <w:style w:type="table" w:default="1" w:styleId="Tablanormal">
+  <w:style w:type="table" w:default="1" w:styleId="TableNormal">
     <w:name w:val="Normal Table"/>
     <w:uiPriority w:val="99"/>
     <w:semiHidden/>
@@ -2142,16 +2492,16 @@
       </w:tblCellMar>
     </w:tblPr>
   </w:style>
-  <w:style w:type="numbering" w:default="1" w:styleId="Sinlista">
+  <w:style w:type="numbering" w:default="1" w:styleId="NoList">
     <w:name w:val="No List"/>
     <w:uiPriority w:val="99"/>
     <w:semiHidden/>
     <w:unhideWhenUsed/>
   </w:style>
-  <w:style w:type="paragraph" w:styleId="Encabezado">
+  <w:style w:type="paragraph" w:styleId="Header">
     <w:name w:val="header"/>
     <w:basedOn w:val="Normal"/>
-    <w:link w:val="EncabezadoCar"/>
+    <w:link w:val="HeaderChar"/>
     <w:uiPriority w:val="99"/>
     <w:unhideWhenUsed/>
     <w:rsid w:val="00E618BF"/>
@@ -2163,17 +2513,17 @@
       <w:spacing w:after="0" w:line="240" w:lineRule="auto"/>
     </w:pPr>
   </w:style>
-  <w:style w:type="character" w:customStyle="1" w:styleId="EncabezadoCar">
-    <w:name w:val="Encabezado Car"/>
-    <w:basedOn w:val="Fuentedeprrafopredeter"/>
-    <w:link w:val="Encabezado"/>
+  <w:style w:type="character" w:customStyle="1" w:styleId="HeaderChar">
+    <w:name w:val="Header Char"/>
+    <w:basedOn w:val="DefaultParagraphFont"/>
+    <w:link w:val="Header"/>
     <w:uiPriority w:val="99"/>
     <w:rsid w:val="00E618BF"/>
   </w:style>
-  <w:style w:type="paragraph" w:styleId="Piedepgina">
+  <w:style w:type="paragraph" w:styleId="Footer">
     <w:name w:val="footer"/>
     <w:basedOn w:val="Normal"/>
-    <w:link w:val="PiedepginaCar"/>
+    <w:link w:val="FooterChar"/>
     <w:uiPriority w:val="99"/>
     <w:unhideWhenUsed/>
     <w:rsid w:val="00E618BF"/>
@@ -2185,14 +2535,14 @@
       <w:spacing w:after="0" w:line="240" w:lineRule="auto"/>
     </w:pPr>
   </w:style>
-  <w:style w:type="character" w:customStyle="1" w:styleId="PiedepginaCar">
-    <w:name w:val="Pie de página Car"/>
-    <w:basedOn w:val="Fuentedeprrafopredeter"/>
-    <w:link w:val="Piedepgina"/>
+  <w:style w:type="character" w:customStyle="1" w:styleId="FooterChar">
+    <w:name w:val="Footer Char"/>
+    <w:basedOn w:val="DefaultParagraphFont"/>
+    <w:link w:val="Footer"/>
     <w:uiPriority w:val="99"/>
     <w:rsid w:val="00E618BF"/>
   </w:style>
-  <w:style w:type="paragraph" w:styleId="Sinespaciado">
+  <w:style w:type="paragraph" w:styleId="NoSpacing">
     <w:name w:val="No Spacing"/>
     <w:uiPriority w:val="1"/>
     <w:qFormat/>
@@ -2201,10 +2551,10 @@
       <w:spacing w:after="0" w:line="240" w:lineRule="auto"/>
     </w:pPr>
   </w:style>
-  <w:style w:type="character" w:customStyle="1" w:styleId="Ttulo1Car">
-    <w:name w:val="Título 1 Car"/>
-    <w:basedOn w:val="Fuentedeprrafopredeter"/>
-    <w:link w:val="Ttulo1"/>
+  <w:style w:type="character" w:customStyle="1" w:styleId="Heading1Char">
+    <w:name w:val="Heading 1 Char"/>
+    <w:basedOn w:val="DefaultParagraphFont"/>
+    <w:link w:val="Heading1"/>
     <w:uiPriority w:val="9"/>
     <w:rsid w:val="00FC693F"/>
     <w:rPr>
@@ -2216,10 +2566,10 @@
       <w:szCs w:val="28"/>
     </w:rPr>
   </w:style>
-  <w:style w:type="character" w:customStyle="1" w:styleId="Ttulo2Car">
-    <w:name w:val="Título 2 Car"/>
-    <w:basedOn w:val="Fuentedeprrafopredeter"/>
-    <w:link w:val="Ttulo2"/>
+  <w:style w:type="character" w:customStyle="1" w:styleId="Heading2Char">
+    <w:name w:val="Heading 2 Char"/>
+    <w:basedOn w:val="DefaultParagraphFont"/>
+    <w:link w:val="Heading2"/>
     <w:uiPriority w:val="9"/>
     <w:rsid w:val="00FC693F"/>
     <w:rPr>
@@ -2231,10 +2581,10 @@
       <w:szCs w:val="26"/>
     </w:rPr>
   </w:style>
-  <w:style w:type="character" w:customStyle="1" w:styleId="Ttulo3Car">
-    <w:name w:val="Título 3 Car"/>
-    <w:basedOn w:val="Fuentedeprrafopredeter"/>
-    <w:link w:val="Ttulo3"/>
+  <w:style w:type="character" w:customStyle="1" w:styleId="Heading3Char">
+    <w:name w:val="Heading 3 Char"/>
+    <w:basedOn w:val="DefaultParagraphFont"/>
+    <w:link w:val="Heading3"/>
     <w:uiPriority w:val="9"/>
     <w:rsid w:val="00FC693F"/>
     <w:rPr>
@@ -2244,11 +2594,11 @@
       <w:color w:val="4F81BD" w:themeColor="accent1"/>
     </w:rPr>
   </w:style>
-  <w:style w:type="paragraph" w:styleId="Ttulo">
+  <w:style w:type="paragraph" w:styleId="Title">
     <w:name w:val="Title"/>
     <w:basedOn w:val="Normal"/>
     <w:next w:val="Normal"/>
-    <w:link w:val="TtuloCar"/>
+    <w:link w:val="TitleChar"/>
     <w:uiPriority w:val="10"/>
     <w:qFormat/>
     <w:rsid w:val="00FC693F"/>
@@ -2264,10 +2614,10 @@
       <w:szCs w:val="52"/>
     </w:rPr>
   </w:style>
-  <w:style w:type="character" w:customStyle="1" w:styleId="TtuloCar">
-    <w:name w:val="Título Car"/>
-    <w:basedOn w:val="Fuentedeprrafopredeter"/>
-    <w:link w:val="Ttulo"/>
+  <w:style w:type="character" w:customStyle="1" w:styleId="TitleChar">
+    <w:name w:val="Title Char"/>
+    <w:basedOn w:val="DefaultParagraphFont"/>
+    <w:link w:val="Title"/>
     <w:uiPriority w:val="10"/>
     <w:rsid w:val="00FC693F"/>
     <w:rPr>
@@ -2279,11 +2629,11 @@
       <w:szCs w:val="52"/>
     </w:rPr>
   </w:style>
-  <w:style w:type="paragraph" w:styleId="Subttulo">
+  <w:style w:type="paragraph" w:styleId="Subtitle">
     <w:name w:val="Subtitle"/>
     <w:basedOn w:val="Normal"/>
     <w:next w:val="Normal"/>
-    <w:link w:val="SubttuloCar"/>
+    <w:link w:val="SubtitleChar"/>
     <w:uiPriority w:val="11"/>
     <w:qFormat/>
     <w:rsid w:val="00FC693F"/>
@@ -2302,10 +2652,10 @@
       <w:szCs w:val="24"/>
     </w:rPr>
   </w:style>
-  <w:style w:type="character" w:customStyle="1" w:styleId="SubttuloCar">
-    <w:name w:val="Subtítulo Car"/>
-    <w:basedOn w:val="Fuentedeprrafopredeter"/>
-    <w:link w:val="Subttulo"/>
+  <w:style w:type="character" w:customStyle="1" w:styleId="SubtitleChar">
+    <w:name w:val="Subtitle Char"/>
+    <w:basedOn w:val="DefaultParagraphFont"/>
+    <w:link w:val="Subtitle"/>
     <w:uiPriority w:val="11"/>
     <w:rsid w:val="00FC693F"/>
     <w:rPr>
@@ -2318,7 +2668,7 @@
       <w:szCs w:val="24"/>
     </w:rPr>
   </w:style>
-  <w:style w:type="paragraph" w:styleId="Prrafodelista">
+  <w:style w:type="paragraph" w:styleId="ListParagraph">
     <w:name w:val="List Paragraph"/>
     <w:basedOn w:val="Normal"/>
     <w:uiPriority w:val="34"/>
@@ -2329,25 +2679,25 @@
       <w:contextualSpacing/>
     </w:pPr>
   </w:style>
-  <w:style w:type="paragraph" w:styleId="Textoindependiente">
+  <w:style w:type="paragraph" w:styleId="BodyText">
     <w:name w:val="Body Text"/>
     <w:basedOn w:val="Normal"/>
-    <w:link w:val="TextoindependienteCar"/>
+    <w:link w:val="BodyTextChar"/>
     <w:uiPriority w:val="99"/>
     <w:unhideWhenUsed/>
     <w:rsid w:val="00AA1D8D"/>
   </w:style>
-  <w:style w:type="character" w:customStyle="1" w:styleId="TextoindependienteCar">
-    <w:name w:val="Texto independiente Car"/>
-    <w:basedOn w:val="Fuentedeprrafopredeter"/>
-    <w:link w:val="Textoindependiente"/>
+  <w:style w:type="character" w:customStyle="1" w:styleId="BodyTextChar">
+    <w:name w:val="Body Text Char"/>
+    <w:basedOn w:val="DefaultParagraphFont"/>
+    <w:link w:val="BodyText"/>
     <w:uiPriority w:val="99"/>
     <w:rsid w:val="00AA1D8D"/>
   </w:style>
-  <w:style w:type="paragraph" w:styleId="Textoindependiente2">
+  <w:style w:type="paragraph" w:styleId="BodyText2">
     <w:name w:val="Body Text 2"/>
     <w:basedOn w:val="Normal"/>
-    <w:link w:val="Textoindependiente2Car"/>
+    <w:link w:val="BodyText2Char"/>
     <w:uiPriority w:val="99"/>
     <w:unhideWhenUsed/>
     <w:rsid w:val="00AA1D8D"/>
@@ -2355,17 +2705,17 @@
       <w:spacing w:line="480" w:lineRule="auto"/>
     </w:pPr>
   </w:style>
-  <w:style w:type="character" w:customStyle="1" w:styleId="Textoindependiente2Car">
-    <w:name w:val="Texto independiente 2 Car"/>
-    <w:basedOn w:val="Fuentedeprrafopredeter"/>
-    <w:link w:val="Textoindependiente2"/>
+  <w:style w:type="character" w:customStyle="1" w:styleId="BodyText2Char">
+    <w:name w:val="Body Text 2 Char"/>
+    <w:basedOn w:val="DefaultParagraphFont"/>
+    <w:link w:val="BodyText2"/>
     <w:uiPriority w:val="99"/>
     <w:rsid w:val="00AA1D8D"/>
   </w:style>
-  <w:style w:type="paragraph" w:styleId="Textoindependiente3">
+  <w:style w:type="paragraph" w:styleId="BodyText3">
     <w:name w:val="Body Text 3"/>
     <w:basedOn w:val="Normal"/>
-    <w:link w:val="Textoindependiente3Car"/>
+    <w:link w:val="BodyText3Char"/>
     <w:uiPriority w:val="99"/>
     <w:unhideWhenUsed/>
     <w:rsid w:val="00AA1D8D"/>
@@ -2374,10 +2724,10 @@
       <w:szCs w:val="16"/>
     </w:rPr>
   </w:style>
-  <w:style w:type="character" w:customStyle="1" w:styleId="Textoindependiente3Car">
-    <w:name w:val="Texto independiente 3 Car"/>
-    <w:basedOn w:val="Fuentedeprrafopredeter"/>
-    <w:link w:val="Textoindependiente3"/>
+  <w:style w:type="character" w:customStyle="1" w:styleId="BodyText3Char">
+    <w:name w:val="Body Text 3 Char"/>
+    <w:basedOn w:val="DefaultParagraphFont"/>
+    <w:link w:val="BodyText3"/>
     <w:uiPriority w:val="99"/>
     <w:rsid w:val="00AA1D8D"/>
     <w:rPr>
@@ -2385,7 +2735,7 @@
       <w:szCs w:val="16"/>
     </w:rPr>
   </w:style>
-  <w:style w:type="paragraph" w:styleId="Lista">
+  <w:style w:type="paragraph" w:styleId="List">
     <w:name w:val="List"/>
     <w:basedOn w:val="Normal"/>
     <w:uiPriority w:val="99"/>
@@ -2396,7 +2746,7 @@
       <w:contextualSpacing/>
     </w:pPr>
   </w:style>
-  <w:style w:type="paragraph" w:styleId="Lista2">
+  <w:style w:type="paragraph" w:styleId="List2">
     <w:name w:val="List 2"/>
     <w:basedOn w:val="Normal"/>
     <w:uiPriority w:val="99"/>
@@ -2407,7 +2757,7 @@
       <w:contextualSpacing/>
     </w:pPr>
   </w:style>
-  <w:style w:type="paragraph" w:styleId="Lista3">
+  <w:style w:type="paragraph" w:styleId="List3">
     <w:name w:val="List 3"/>
     <w:basedOn w:val="Normal"/>
     <w:uiPriority w:val="99"/>
@@ -2418,7 +2768,7 @@
       <w:contextualSpacing/>
     </w:pPr>
   </w:style>
-  <w:style w:type="paragraph" w:styleId="Listaconvietas">
+  <w:style w:type="paragraph" w:styleId="ListBullet">
     <w:name w:val="List Bullet"/>
     <w:basedOn w:val="Normal"/>
     <w:uiPriority w:val="99"/>
@@ -2431,7 +2781,7 @@
       <w:contextualSpacing/>
     </w:pPr>
   </w:style>
-  <w:style w:type="paragraph" w:styleId="Listaconvietas2">
+  <w:style w:type="paragraph" w:styleId="ListBullet2">
     <w:name w:val="List Bullet 2"/>
     <w:basedOn w:val="Normal"/>
     <w:uiPriority w:val="99"/>
@@ -2444,7 +2794,7 @@
       <w:contextualSpacing/>
     </w:pPr>
   </w:style>
-  <w:style w:type="paragraph" w:styleId="Listaconvietas3">
+  <w:style w:type="paragraph" w:styleId="ListBullet3">
     <w:name w:val="List Bullet 3"/>
     <w:basedOn w:val="Normal"/>
     <w:uiPriority w:val="99"/>
@@ -2457,7 +2807,7 @@
       <w:contextualSpacing/>
     </w:pPr>
   </w:style>
-  <w:style w:type="paragraph" w:styleId="Listaconnmeros">
+  <w:style w:type="paragraph" w:styleId="ListNumber">
     <w:name w:val="List Number"/>
     <w:basedOn w:val="Normal"/>
     <w:uiPriority w:val="99"/>
@@ -2470,7 +2820,7 @@
       <w:contextualSpacing/>
     </w:pPr>
   </w:style>
-  <w:style w:type="paragraph" w:styleId="Listaconnmeros2">
+  <w:style w:type="paragraph" w:styleId="ListNumber2">
     <w:name w:val="List Number 2"/>
     <w:basedOn w:val="Normal"/>
     <w:uiPriority w:val="99"/>
@@ -2483,7 +2833,7 @@
       <w:contextualSpacing/>
     </w:pPr>
   </w:style>
-  <w:style w:type="paragraph" w:styleId="Listaconnmeros3">
+  <w:style w:type="paragraph" w:styleId="ListNumber3">
     <w:name w:val="List Number 3"/>
     <w:basedOn w:val="Normal"/>
     <w:uiPriority w:val="99"/>
@@ -2496,7 +2846,7 @@
       <w:contextualSpacing/>
     </w:pPr>
   </w:style>
-  <w:style w:type="paragraph" w:styleId="Continuarlista">
+  <w:style w:type="paragraph" w:styleId="ListContinue">
     <w:name w:val="List Continue"/>
     <w:basedOn w:val="Normal"/>
     <w:uiPriority w:val="99"/>
@@ -2507,7 +2857,7 @@
       <w:contextualSpacing/>
     </w:pPr>
   </w:style>
-  <w:style w:type="paragraph" w:styleId="Continuarlista2">
+  <w:style w:type="paragraph" w:styleId="ListContinue2">
     <w:name w:val="List Continue 2"/>
     <w:basedOn w:val="Normal"/>
     <w:uiPriority w:val="99"/>
@@ -2518,7 +2868,7 @@
       <w:contextualSpacing/>
     </w:pPr>
   </w:style>
-  <w:style w:type="paragraph" w:styleId="Continuarlista3">
+  <w:style w:type="paragraph" w:styleId="ListContinue3">
     <w:name w:val="List Continue 3"/>
     <w:basedOn w:val="Normal"/>
     <w:uiPriority w:val="99"/>
@@ -2529,9 +2879,9 @@
       <w:contextualSpacing/>
     </w:pPr>
   </w:style>
-  <w:style w:type="paragraph" w:styleId="Textomacro">
+  <w:style w:type="paragraph" w:styleId="MacroText">
     <w:name w:val="macro"/>
-    <w:link w:val="TextomacroCar"/>
+    <w:link w:val="MacroTextChar"/>
     <w:uiPriority w:val="99"/>
     <w:unhideWhenUsed/>
     <w:rsid w:val="0029639D"/>
@@ -2552,10 +2902,10 @@
       <w:szCs w:val="20"/>
     </w:rPr>
   </w:style>
-  <w:style w:type="character" w:customStyle="1" w:styleId="TextomacroCar">
-    <w:name w:val="Texto macro Car"/>
-    <w:basedOn w:val="Fuentedeprrafopredeter"/>
-    <w:link w:val="Textomacro"/>
+  <w:style w:type="character" w:customStyle="1" w:styleId="MacroTextChar">
+    <w:name w:val="Macro Text Char"/>
+    <w:basedOn w:val="DefaultParagraphFont"/>
+    <w:link w:val="MacroText"/>
     <w:uiPriority w:val="99"/>
     <w:rsid w:val="0029639D"/>
     <w:rPr>
@@ -2564,11 +2914,11 @@
       <w:szCs w:val="20"/>
     </w:rPr>
   </w:style>
-  <w:style w:type="paragraph" w:styleId="Cita">
+  <w:style w:type="paragraph" w:styleId="Quote">
     <w:name w:val="Quote"/>
     <w:basedOn w:val="Normal"/>
     <w:next w:val="Normal"/>
-    <w:link w:val="CitaCar"/>
+    <w:link w:val="QuoteChar"/>
     <w:uiPriority w:val="29"/>
     <w:qFormat/>
     <w:rsid w:val="00FC693F"/>
@@ -2578,10 +2928,10 @@
       <w:color w:val="000000" w:themeColor="text1"/>
     </w:rPr>
   </w:style>
-  <w:style w:type="character" w:customStyle="1" w:styleId="CitaCar">
-    <w:name w:val="Cita Car"/>
-    <w:basedOn w:val="Fuentedeprrafopredeter"/>
-    <w:link w:val="Cita"/>
+  <w:style w:type="character" w:customStyle="1" w:styleId="QuoteChar">
+    <w:name w:val="Quote Char"/>
+    <w:basedOn w:val="DefaultParagraphFont"/>
+    <w:link w:val="Quote"/>
     <w:uiPriority w:val="29"/>
     <w:rsid w:val="00FC693F"/>
     <w:rPr>
@@ -2590,10 +2940,10 @@
       <w:color w:val="000000" w:themeColor="text1"/>
     </w:rPr>
   </w:style>
-  <w:style w:type="character" w:customStyle="1" w:styleId="Ttulo4Car">
-    <w:name w:val="Título 4 Car"/>
-    <w:basedOn w:val="Fuentedeprrafopredeter"/>
-    <w:link w:val="Ttulo4"/>
+  <w:style w:type="character" w:customStyle="1" w:styleId="Heading4Char">
+    <w:name w:val="Heading 4 Char"/>
+    <w:basedOn w:val="DefaultParagraphFont"/>
+    <w:link w:val="Heading4"/>
     <w:uiPriority w:val="9"/>
     <w:semiHidden/>
     <w:rsid w:val="00FC693F"/>
@@ -2606,10 +2956,10 @@
       <w:color w:val="4F81BD" w:themeColor="accent1"/>
     </w:rPr>
   </w:style>
-  <w:style w:type="character" w:customStyle="1" w:styleId="Ttulo5Car">
-    <w:name w:val="Título 5 Car"/>
-    <w:basedOn w:val="Fuentedeprrafopredeter"/>
-    <w:link w:val="Ttulo5"/>
+  <w:style w:type="character" w:customStyle="1" w:styleId="Heading5Char">
+    <w:name w:val="Heading 5 Char"/>
+    <w:basedOn w:val="DefaultParagraphFont"/>
+    <w:link w:val="Heading5"/>
     <w:uiPriority w:val="9"/>
     <w:semiHidden/>
     <w:rsid w:val="00FC693F"/>
@@ -2618,10 +2968,10 @@
       <w:color w:val="243F60" w:themeColor="accent1" w:themeShade="7F"/>
     </w:rPr>
   </w:style>
-  <w:style w:type="character" w:customStyle="1" w:styleId="Ttulo6Car">
-    <w:name w:val="Título 6 Car"/>
-    <w:basedOn w:val="Fuentedeprrafopredeter"/>
-    <w:link w:val="Ttulo6"/>
+  <w:style w:type="character" w:customStyle="1" w:styleId="Heading6Char">
+    <w:name w:val="Heading 6 Char"/>
+    <w:basedOn w:val="DefaultParagraphFont"/>
+    <w:link w:val="Heading6"/>
     <w:uiPriority w:val="9"/>
     <w:semiHidden/>
     <w:rsid w:val="00FC693F"/>
@@ -2632,10 +2982,10 @@
       <w:color w:val="243F60" w:themeColor="accent1" w:themeShade="7F"/>
     </w:rPr>
   </w:style>
-  <w:style w:type="character" w:customStyle="1" w:styleId="Ttulo7Car">
-    <w:name w:val="Título 7 Car"/>
-    <w:basedOn w:val="Fuentedeprrafopredeter"/>
-    <w:link w:val="Ttulo7"/>
+  <w:style w:type="character" w:customStyle="1" w:styleId="Heading7Char">
+    <w:name w:val="Heading 7 Char"/>
+    <w:basedOn w:val="DefaultParagraphFont"/>
+    <w:link w:val="Heading7"/>
     <w:uiPriority w:val="9"/>
     <w:semiHidden/>
     <w:rsid w:val="00FC693F"/>
@@ -2646,10 +2996,10 @@
       <w:color w:val="404040" w:themeColor="text1" w:themeTint="BF"/>
     </w:rPr>
   </w:style>
-  <w:style w:type="character" w:customStyle="1" w:styleId="Ttulo8Car">
-    <w:name w:val="Título 8 Car"/>
-    <w:basedOn w:val="Fuentedeprrafopredeter"/>
-    <w:link w:val="Ttulo8"/>
+  <w:style w:type="character" w:customStyle="1" w:styleId="Heading8Char">
+    <w:name w:val="Heading 8 Char"/>
+    <w:basedOn w:val="DefaultParagraphFont"/>
+    <w:link w:val="Heading8"/>
     <w:uiPriority w:val="9"/>
     <w:semiHidden/>
     <w:rsid w:val="00FC693F"/>
@@ -2660,10 +3010,10 @@
       <w:szCs w:val="20"/>
     </w:rPr>
   </w:style>
-  <w:style w:type="character" w:customStyle="1" w:styleId="Ttulo9Car">
-    <w:name w:val="Título 9 Car"/>
-    <w:basedOn w:val="Fuentedeprrafopredeter"/>
-    <w:link w:val="Ttulo9"/>
+  <w:style w:type="character" w:customStyle="1" w:styleId="Heading9Char">
+    <w:name w:val="Heading 9 Char"/>
+    <w:basedOn w:val="DefaultParagraphFont"/>
+    <w:link w:val="Heading9"/>
     <w:uiPriority w:val="9"/>
     <w:semiHidden/>
     <w:rsid w:val="00FC693F"/>
@@ -2676,7 +3026,7 @@
       <w:szCs w:val="20"/>
     </w:rPr>
   </w:style>
-  <w:style w:type="paragraph" w:styleId="Descripcin">
+  <w:style w:type="paragraph" w:styleId="Caption">
     <w:name w:val="caption"/>
     <w:basedOn w:val="Normal"/>
     <w:next w:val="Normal"/>
@@ -2696,9 +3046,9 @@
       <w:szCs w:val="18"/>
     </w:rPr>
   </w:style>
-  <w:style w:type="character" w:styleId="Fuerte">
+  <w:style w:type="character" w:styleId="Strong">
     <w:name w:val="Strong"/>
-    <w:basedOn w:val="Fuentedeprrafopredeter"/>
+    <w:basedOn w:val="DefaultParagraphFont"/>
     <w:uiPriority w:val="22"/>
     <w:qFormat/>
     <w:rsid w:val="00FC693F"/>
@@ -2707,9 +3057,9 @@
       <w:bCs/>
     </w:rPr>
   </w:style>
-  <w:style w:type="character" w:styleId="nfasis">
+  <w:style w:type="character" w:styleId="Emphasis">
     <w:name w:val="Emphasis"/>
-    <w:basedOn w:val="Fuentedeprrafopredeter"/>
+    <w:basedOn w:val="DefaultParagraphFont"/>
     <w:uiPriority w:val="20"/>
     <w:qFormat/>
     <w:rsid w:val="00FC693F"/>
@@ -2718,11 +3068,11 @@
       <w:iCs/>
     </w:rPr>
   </w:style>
-  <w:style w:type="paragraph" w:styleId="Citadestacada">
+  <w:style w:type="paragraph" w:styleId="IntenseQuote">
     <w:name w:val="Intense Quote"/>
     <w:basedOn w:val="Normal"/>
     <w:next w:val="Normal"/>
-    <w:link w:val="CitadestacadaCar"/>
+    <w:link w:val="IntenseQuoteChar"/>
     <w:uiPriority w:val="30"/>
     <w:qFormat/>
     <w:rsid w:val="00FC693F"/>
@@ -2738,10 +3088,10 @@
       <w:color w:val="4F81BD" w:themeColor="accent1"/>
     </w:rPr>
   </w:style>
-  <w:style w:type="character" w:customStyle="1" w:styleId="CitadestacadaCar">
-    <w:name w:val="Cita destacada Car"/>
-    <w:basedOn w:val="Fuentedeprrafopredeter"/>
-    <w:link w:val="Citadestacada"/>
+  <w:style w:type="character" w:customStyle="1" w:styleId="IntenseQuoteChar">
+    <w:name w:val="Intense Quote Char"/>
+    <w:basedOn w:val="DefaultParagraphFont"/>
+    <w:link w:val="IntenseQuote"/>
     <w:uiPriority w:val="30"/>
     <w:rsid w:val="00FC693F"/>
     <w:rPr>
@@ -2752,9 +3102,9 @@
       <w:color w:val="4F81BD" w:themeColor="accent1"/>
     </w:rPr>
   </w:style>
-  <w:style w:type="character" w:styleId="nfasissutil">
+  <w:style w:type="character" w:styleId="SubtleEmphasis">
     <w:name w:val="Subtle Emphasis"/>
-    <w:basedOn w:val="Fuentedeprrafopredeter"/>
+    <w:basedOn w:val="DefaultParagraphFont"/>
     <w:uiPriority w:val="19"/>
     <w:qFormat/>
     <w:rsid w:val="00FC693F"/>
@@ -2764,9 +3114,9 @@
       <w:color w:val="808080" w:themeColor="text1" w:themeTint="7F"/>
     </w:rPr>
   </w:style>
-  <w:style w:type="character" w:styleId="nfasisintenso">
+  <w:style w:type="character" w:styleId="IntenseEmphasis">
     <w:name w:val="Intense Emphasis"/>
-    <w:basedOn w:val="Fuentedeprrafopredeter"/>
+    <w:basedOn w:val="DefaultParagraphFont"/>
     <w:uiPriority w:val="21"/>
     <w:qFormat/>
     <w:rsid w:val="00FC693F"/>
@@ -2778,9 +3128,9 @@
       <w:color w:val="4F81BD" w:themeColor="accent1"/>
     </w:rPr>
   </w:style>
-  <w:style w:type="character" w:styleId="Referenciasutil">
+  <w:style w:type="character" w:styleId="SubtleReference">
     <w:name w:val="Subtle Reference"/>
-    <w:basedOn w:val="Fuentedeprrafopredeter"/>
+    <w:basedOn w:val="DefaultParagraphFont"/>
     <w:uiPriority w:val="31"/>
     <w:qFormat/>
     <w:rsid w:val="00FC693F"/>
@@ -2790,9 +3140,9 @@
       <w:u w:val="single"/>
     </w:rPr>
   </w:style>
-  <w:style w:type="character" w:styleId="Referenciaintensa">
+  <w:style w:type="character" w:styleId="IntenseReference">
     <w:name w:val="Intense Reference"/>
-    <w:basedOn w:val="Fuentedeprrafopredeter"/>
+    <w:basedOn w:val="DefaultParagraphFont"/>
     <w:uiPriority w:val="32"/>
     <w:qFormat/>
     <w:rsid w:val="00FC693F"/>
@@ -2805,9 +3155,9 @@
       <w:u w:val="single"/>
     </w:rPr>
   </w:style>
-  <w:style w:type="character" w:styleId="Ttulodellibro">
+  <w:style w:type="character" w:styleId="BookTitle">
     <w:name w:val="Book Title"/>
-    <w:basedOn w:val="Fuentedeprrafopredeter"/>
+    <w:basedOn w:val="DefaultParagraphFont"/>
     <w:uiPriority w:val="33"/>
     <w:qFormat/>
     <w:rsid w:val="00FC693F"/>
@@ -2818,9 +3168,9 @@
       <w:spacing w:val="5"/>
     </w:rPr>
   </w:style>
-  <w:style w:type="paragraph" w:styleId="TtuloTDC">
+  <w:style w:type="paragraph" w:styleId="TOCHeading">
     <w:name w:val="TOC Heading"/>
-    <w:basedOn w:val="Ttulo1"/>
+    <w:basedOn w:val="Heading1"/>
     <w:next w:val="Normal"/>
     <w:uiPriority w:val="39"/>
     <w:semiHidden/>
@@ -2831,9 +3181,9 @@
       <w:outlineLvl w:val="9"/>
     </w:pPr>
   </w:style>
-  <w:style w:type="table" w:styleId="Tablaconcuadrcula">
+  <w:style w:type="table" w:styleId="TableGrid">
     <w:name w:val="Table Grid"/>
-    <w:basedOn w:val="Tablanormal"/>
+    <w:basedOn w:val="TableNormal"/>
     <w:uiPriority w:val="59"/>
     <w:rsid w:val="00FC693F"/>
     <w:pPr>
@@ -2850,9 +3200,9 @@
       </w:tblBorders>
     </w:tblPr>
   </w:style>
-  <w:style w:type="table" w:styleId="Sombreadoclaro">
+  <w:style w:type="table" w:styleId="LightShading">
     <w:name w:val="Light Shading"/>
-    <w:basedOn w:val="Tablanormal"/>
+    <w:basedOn w:val="TableNormal"/>
     <w:uiPriority w:val="60"/>
     <w:rsid w:val="00FC693F"/>
     <w:pPr>
@@ -2946,9 +3296,9 @@
       </w:tcPr>
     </w:tblStylePr>
   </w:style>
-  <w:style w:type="table" w:styleId="Sombreadoclaro-nfasis1">
+  <w:style w:type="table" w:styleId="LightShading-Accent1">
     <w:name w:val="Light Shading Accent 1"/>
-    <w:basedOn w:val="Tablanormal"/>
+    <w:basedOn w:val="TableNormal"/>
     <w:uiPriority w:val="60"/>
     <w:rsid w:val="00FC693F"/>
     <w:pPr>
@@ -3042,9 +3392,9 @@
       </w:tcPr>
     </w:tblStylePr>
   </w:style>
-  <w:style w:type="table" w:styleId="Sombreadoclaro-nfasis2">
+  <w:style w:type="table" w:styleId="LightShading-Accent2">
     <w:name w:val="Light Shading Accent 2"/>
-    <w:basedOn w:val="Tablanormal"/>
+    <w:basedOn w:val="TableNormal"/>
     <w:uiPriority w:val="60"/>
     <w:rsid w:val="00FC693F"/>
     <w:pPr>
@@ -3138,9 +3488,9 @@
       </w:tcPr>
     </w:tblStylePr>
   </w:style>
-  <w:style w:type="table" w:styleId="Sombreadoclaro-nfasis3">
+  <w:style w:type="table" w:styleId="LightShading-Accent3">
     <w:name w:val="Light Shading Accent 3"/>
-    <w:basedOn w:val="Tablanormal"/>
+    <w:basedOn w:val="TableNormal"/>
     <w:uiPriority w:val="60"/>
     <w:rsid w:val="00FC693F"/>
     <w:pPr>
@@ -3234,9 +3584,9 @@
       </w:tcPr>
     </w:tblStylePr>
   </w:style>
-  <w:style w:type="table" w:styleId="Sombreadoclaro-nfasis4">
+  <w:style w:type="table" w:styleId="LightShading-Accent4">
     <w:name w:val="Light Shading Accent 4"/>
-    <w:basedOn w:val="Tablanormal"/>
+    <w:basedOn w:val="TableNormal"/>
     <w:uiPriority w:val="60"/>
     <w:rsid w:val="00FC693F"/>
     <w:pPr>
@@ -3330,9 +3680,9 @@
       </w:tcPr>
     </w:tblStylePr>
   </w:style>
-  <w:style w:type="table" w:styleId="Sombreadoclaro-nfasis5">
+  <w:style w:type="table" w:styleId="LightShading-Accent5">
     <w:name w:val="Light Shading Accent 5"/>
-    <w:basedOn w:val="Tablanormal"/>
+    <w:basedOn w:val="TableNormal"/>
     <w:uiPriority w:val="60"/>
     <w:rsid w:val="00FC693F"/>
     <w:pPr>
@@ -3426,9 +3776,9 @@
       </w:tcPr>
     </w:tblStylePr>
   </w:style>
-  <w:style w:type="table" w:styleId="Sombreadoclaro-nfasis6">
+  <w:style w:type="table" w:styleId="LightShading-Accent6">
     <w:name w:val="Light Shading Accent 6"/>
-    <w:basedOn w:val="Tablanormal"/>
+    <w:basedOn w:val="TableNormal"/>
     <w:uiPriority w:val="60"/>
     <w:rsid w:val="00FC693F"/>
     <w:pPr>
@@ -3522,9 +3872,9 @@
       </w:tcPr>
     </w:tblStylePr>
   </w:style>
-  <w:style w:type="table" w:styleId="Listaclara">
+  <w:style w:type="table" w:styleId="LightList">
     <w:name w:val="Light List"/>
-    <w:basedOn w:val="Tablanormal"/>
+    <w:basedOn w:val="TableNormal"/>
     <w:uiPriority w:val="61"/>
     <w:rsid w:val="00FC693F"/>
     <w:pPr>
@@ -3607,9 +3957,9 @@
       </w:tcPr>
     </w:tblStylePr>
   </w:style>
-  <w:style w:type="table" w:styleId="Listaclara-nfasis1">
+  <w:style w:type="table" w:styleId="LightList-Accent1">
     <w:name w:val="Light List Accent 1"/>
-    <w:basedOn w:val="Tablanormal"/>
+    <w:basedOn w:val="TableNormal"/>
     <w:uiPriority w:val="61"/>
     <w:rsid w:val="00FC693F"/>
     <w:pPr>
@@ -3692,9 +4042,9 @@
       </w:tcPr>
     </w:tblStylePr>
   </w:style>
-  <w:style w:type="table" w:styleId="Listaclara-nfasis2">
+  <w:style w:type="table" w:styleId="LightList-Accent2">
     <w:name w:val="Light List Accent 2"/>
-    <w:basedOn w:val="Tablanormal"/>
+    <w:basedOn w:val="TableNormal"/>
     <w:uiPriority w:val="61"/>
     <w:rsid w:val="00CB0664"/>
     <w:pPr>
@@ -3777,9 +4127,9 @@
       </w:tcPr>
     </w:tblStylePr>
   </w:style>
-  <w:style w:type="table" w:styleId="Listaclara-nfasis3">
+  <w:style w:type="table" w:styleId="LightList-Accent3">
     <w:name w:val="Light List Accent 3"/>
-    <w:basedOn w:val="Tablanormal"/>
+    <w:basedOn w:val="TableNormal"/>
     <w:uiPriority w:val="61"/>
     <w:rsid w:val="00CB0664"/>
     <w:pPr>
@@ -3862,9 +4212,9 @@
       </w:tcPr>
     </w:tblStylePr>
   </w:style>
-  <w:style w:type="table" w:styleId="Listaclara-nfasis4">
+  <w:style w:type="table" w:styleId="LightList-Accent4">
     <w:name w:val="Light List Accent 4"/>
-    <w:basedOn w:val="Tablanormal"/>
+    <w:basedOn w:val="TableNormal"/>
     <w:uiPriority w:val="61"/>
     <w:rsid w:val="00CB0664"/>
     <w:pPr>
@@ -3947,9 +4297,9 @@
       </w:tcPr>
     </w:tblStylePr>
   </w:style>
-  <w:style w:type="table" w:styleId="Listaclara-nfasis5">
+  <w:style w:type="table" w:styleId="LightList-Accent5">
     <w:name w:val="Light List Accent 5"/>
-    <w:basedOn w:val="Tablanormal"/>
+    <w:basedOn w:val="TableNormal"/>
     <w:uiPriority w:val="61"/>
     <w:rsid w:val="00CB0664"/>
     <w:pPr>
@@ -4032,9 +4382,9 @@
       </w:tcPr>
     </w:tblStylePr>
   </w:style>
-  <w:style w:type="table" w:styleId="Listaclara-nfasis6">
+  <w:style w:type="table" w:styleId="LightList-Accent6">
     <w:name w:val="Light List Accent 6"/>
-    <w:basedOn w:val="Tablanormal"/>
+    <w:basedOn w:val="TableNormal"/>
     <w:uiPriority w:val="61"/>
     <w:rsid w:val="00CB0664"/>
     <w:pPr>
@@ -4117,9 +4467,9 @@
       </w:tcPr>
     </w:tblStylePr>
   </w:style>
-  <w:style w:type="table" w:styleId="Cuadrculaclara">
+  <w:style w:type="table" w:styleId="LightGrid">
     <w:name w:val="Light Grid"/>
-    <w:basedOn w:val="Tablanormal"/>
+    <w:basedOn w:val="TableNormal"/>
     <w:uiPriority w:val="62"/>
     <w:rsid w:val="00CB0664"/>
     <w:pPr>
@@ -4240,9 +4590,9 @@
       </w:tcPr>
     </w:tblStylePr>
   </w:style>
-  <w:style w:type="table" w:styleId="Cuadrculaclara-nfasis1">
+  <w:style w:type="table" w:styleId="LightGrid-Accent1">
     <w:name w:val="Light Grid Accent 1"/>
-    <w:basedOn w:val="Tablanormal"/>
+    <w:basedOn w:val="TableNormal"/>
     <w:uiPriority w:val="62"/>
     <w:rsid w:val="00CB0664"/>
     <w:pPr>
@@ -4363,9 +4713,9 @@
       </w:tcPr>
     </w:tblStylePr>
   </w:style>
-  <w:style w:type="table" w:styleId="Cuadrculaclara-nfasis2">
+  <w:style w:type="table" w:styleId="LightGrid-Accent2">
     <w:name w:val="Light Grid Accent 2"/>
-    <w:basedOn w:val="Tablanormal"/>
+    <w:basedOn w:val="TableNormal"/>
     <w:uiPriority w:val="62"/>
     <w:rsid w:val="00CB0664"/>
     <w:pPr>
@@ -4486,9 +4836,9 @@
       </w:tcPr>
     </w:tblStylePr>
   </w:style>
-  <w:style w:type="table" w:styleId="Cuadrculaclara-nfasis3">
+  <w:style w:type="table" w:styleId="LightGrid-Accent3">
     <w:name w:val="Light Grid Accent 3"/>
-    <w:basedOn w:val="Tablanormal"/>
+    <w:basedOn w:val="TableNormal"/>
     <w:uiPriority w:val="62"/>
     <w:rsid w:val="00CB0664"/>
     <w:pPr>
@@ -4609,9 +4959,9 @@
       </w:tcPr>
     </w:tblStylePr>
   </w:style>
-  <w:style w:type="table" w:styleId="Cuadrculaclara-nfasis4">
+  <w:style w:type="table" w:styleId="LightGrid-Accent4">
     <w:name w:val="Light Grid Accent 4"/>
-    <w:basedOn w:val="Tablanormal"/>
+    <w:basedOn w:val="TableNormal"/>
     <w:uiPriority w:val="62"/>
     <w:rsid w:val="00CB0664"/>
     <w:pPr>
@@ -4732,9 +5082,9 @@
       </w:tcPr>
     </w:tblStylePr>
   </w:style>
-  <w:style w:type="table" w:styleId="Cuadrculaclara-nfasis5">
+  <w:style w:type="table" w:styleId="LightGrid-Accent5">
     <w:name w:val="Light Grid Accent 5"/>
-    <w:basedOn w:val="Tablanormal"/>
+    <w:basedOn w:val="TableNormal"/>
     <w:uiPriority w:val="62"/>
     <w:rsid w:val="00CB0664"/>
     <w:pPr>
@@ -4855,9 +5205,9 @@
       </w:tcPr>
     </w:tblStylePr>
   </w:style>
-  <w:style w:type="table" w:styleId="Cuadrculaclara-nfasis6">
+  <w:style w:type="table" w:styleId="LightGrid-Accent6">
     <w:name w:val="Light Grid Accent 6"/>
-    <w:basedOn w:val="Tablanormal"/>
+    <w:basedOn w:val="TableNormal"/>
     <w:uiPriority w:val="62"/>
     <w:rsid w:val="00CB0664"/>
     <w:pPr>
@@ -4978,9 +5328,9 @@
       </w:tcPr>
     </w:tblStylePr>
   </w:style>
-  <w:style w:type="table" w:styleId="Sombreadomedio1">
+  <w:style w:type="table" w:styleId="MediumShading1">
     <w:name w:val="Medium Shading 1"/>
-    <w:basedOn w:val="Tablanormal"/>
+    <w:basedOn w:val="TableNormal"/>
     <w:uiPriority w:val="63"/>
     <w:rsid w:val="00CB0664"/>
     <w:pPr>
@@ -5077,9 +5427,9 @@
       </w:tcPr>
     </w:tblStylePr>
   </w:style>
-  <w:style w:type="table" w:styleId="Sombreadomedio1-nfasis1">
+  <w:style w:type="table" w:styleId="MediumShading1-Accent1">
     <w:name w:val="Medium Shading 1 Accent 1"/>
-    <w:basedOn w:val="Tablanormal"/>
+    <w:basedOn w:val="TableNormal"/>
     <w:uiPriority w:val="63"/>
     <w:rsid w:val="00CB0664"/>
     <w:pPr>
@@ -5176,9 +5526,9 @@
       </w:tcPr>
     </w:tblStylePr>
   </w:style>
-  <w:style w:type="table" w:styleId="Sombreadomedio1-nfasis2">
+  <w:style w:type="table" w:styleId="MediumShading1-Accent2">
     <w:name w:val="Medium Shading 1 Accent 2"/>
-    <w:basedOn w:val="Tablanormal"/>
+    <w:basedOn w:val="TableNormal"/>
     <w:uiPriority w:val="63"/>
     <w:rsid w:val="00CB0664"/>
     <w:pPr>
@@ -5275,9 +5625,9 @@
       </w:tcPr>
     </w:tblStylePr>
   </w:style>
-  <w:style w:type="table" w:styleId="Sombreadomedio1-nfasis3">
+  <w:style w:type="table" w:styleId="MediumShading1-Accent3">
     <w:name w:val="Medium Shading 1 Accent 3"/>
-    <w:basedOn w:val="Tablanormal"/>
+    <w:basedOn w:val="TableNormal"/>
     <w:uiPriority w:val="63"/>
     <w:rsid w:val="00CB0664"/>
     <w:pPr>
@@ -5374,9 +5724,9 @@
       </w:tcPr>
     </w:tblStylePr>
   </w:style>
-  <w:style w:type="table" w:styleId="Sombreadomedio1-nfasis4">
+  <w:style w:type="table" w:styleId="MediumShading1-Accent4">
     <w:name w:val="Medium Shading 1 Accent 4"/>
-    <w:basedOn w:val="Tablanormal"/>
+    <w:basedOn w:val="TableNormal"/>
     <w:uiPriority w:val="63"/>
     <w:rsid w:val="00CB0664"/>
     <w:pPr>
@@ -5473,9 +5823,9 @@
       </w:tcPr>
     </w:tblStylePr>
   </w:style>
-  <w:style w:type="table" w:styleId="Sombreadomedio1-nfasis5">
+  <w:style w:type="table" w:styleId="MediumShading1-Accent5">
     <w:name w:val="Medium Shading 1 Accent 5"/>
-    <w:basedOn w:val="Tablanormal"/>
+    <w:basedOn w:val="TableNormal"/>
     <w:uiPriority w:val="63"/>
     <w:rsid w:val="00CB0664"/>
     <w:pPr>
@@ -5572,9 +5922,9 @@
       </w:tcPr>
     </w:tblStylePr>
   </w:style>
-  <w:style w:type="table" w:styleId="Sombreadomedio1-nfasis6">
+  <w:style w:type="table" w:styleId="MediumShading1-Accent6">
     <w:name w:val="Medium Shading 1 Accent 6"/>
-    <w:basedOn w:val="Tablanormal"/>
+    <w:basedOn w:val="TableNormal"/>
     <w:uiPriority w:val="63"/>
     <w:rsid w:val="00CB0664"/>
     <w:pPr>
@@ -5671,9 +6021,9 @@
       </w:tcPr>
     </w:tblStylePr>
   </w:style>
-  <w:style w:type="table" w:styleId="Sombreadomedio2">
+  <w:style w:type="table" w:styleId="MediumShading2">
     <w:name w:val="Medium Shading 2"/>
-    <w:basedOn w:val="Tablanormal"/>
+    <w:basedOn w:val="TableNormal"/>
     <w:uiPriority w:val="64"/>
     <w:rsid w:val="00CB0664"/>
     <w:pPr>
@@ -5813,9 +6163,9 @@
       </w:tcPr>
     </w:tblStylePr>
   </w:style>
-  <w:style w:type="table" w:styleId="Sombreadomedio2-nfasis1">
+  <w:style w:type="table" w:styleId="MediumShading2-Accent1">
     <w:name w:val="Medium Shading 2 Accent 1"/>
-    <w:basedOn w:val="Tablanormal"/>
+    <w:basedOn w:val="TableNormal"/>
     <w:uiPriority w:val="64"/>
     <w:rsid w:val="00CB0664"/>
     <w:pPr>
@@ -5955,9 +6305,9 @@
       </w:tcPr>
     </w:tblStylePr>
   </w:style>
-  <w:style w:type="table" w:styleId="Sombreadomedio2-nfasis2">
+  <w:style w:type="table" w:styleId="MediumShading2-Accent2">
     <w:name w:val="Medium Shading 2 Accent 2"/>
-    <w:basedOn w:val="Tablanormal"/>
+    <w:basedOn w:val="TableNormal"/>
     <w:uiPriority w:val="64"/>
     <w:rsid w:val="00CB0664"/>
     <w:pPr>
@@ -6097,9 +6447,9 @@
       </w:tcPr>
     </w:tblStylePr>
   </w:style>
-  <w:style w:type="table" w:styleId="Sombreadomedio2-nfasis3">
+  <w:style w:type="table" w:styleId="MediumShading2-Accent3">
     <w:name w:val="Medium Shading 2 Accent 3"/>
-    <w:basedOn w:val="Tablanormal"/>
+    <w:basedOn w:val="TableNormal"/>
     <w:uiPriority w:val="64"/>
     <w:rsid w:val="00CB0664"/>
     <w:pPr>
@@ -6239,9 +6589,9 @@
       </w:tcPr>
     </w:tblStylePr>
   </w:style>
-  <w:style w:type="table" w:styleId="Sombreadomedio2-nfasis4">
+  <w:style w:type="table" w:styleId="MediumShading2-Accent4">
     <w:name w:val="Medium Shading 2 Accent 4"/>
-    <w:basedOn w:val="Tablanormal"/>
+    <w:basedOn w:val="TableNormal"/>
     <w:uiPriority w:val="64"/>
     <w:rsid w:val="00CB0664"/>
     <w:pPr>
@@ -6381,9 +6731,9 @@
       </w:tcPr>
     </w:tblStylePr>
   </w:style>
-  <w:style w:type="table" w:styleId="Sombreadomedio2-nfasis5">
+  <w:style w:type="table" w:styleId="MediumShading2-Accent5">
     <w:name w:val="Medium Shading 2 Accent 5"/>
-    <w:basedOn w:val="Tablanormal"/>
+    <w:basedOn w:val="TableNormal"/>
     <w:uiPriority w:val="64"/>
     <w:rsid w:val="00CB0664"/>
     <w:pPr>
@@ -6523,9 +6873,9 @@
       </w:tcPr>
     </w:tblStylePr>
   </w:style>
-  <w:style w:type="table" w:styleId="Sombreadomedio2-nfasis6">
+  <w:style w:type="table" w:styleId="MediumShading2-Accent6">
     <w:name w:val="Medium Shading 2 Accent 6"/>
-    <w:basedOn w:val="Tablanormal"/>
+    <w:basedOn w:val="TableNormal"/>
     <w:uiPriority w:val="64"/>
     <w:rsid w:val="00CB0664"/>
     <w:pPr>
@@ -6665,9 +7015,9 @@
       </w:tcPr>
     </w:tblStylePr>
   </w:style>
-  <w:style w:type="table" w:styleId="Listamedia1">
+  <w:style w:type="table" w:styleId="MediumList1">
     <w:name w:val="Medium List 1"/>
-    <w:basedOn w:val="Tablanormal"/>
+    <w:basedOn w:val="TableNormal"/>
     <w:uiPriority w:val="65"/>
     <w:rsid w:val="00CB0664"/>
     <w:pPr>
@@ -6742,9 +7092,9 @@
       </w:tcPr>
     </w:tblStylePr>
   </w:style>
-  <w:style w:type="table" w:styleId="Listamedia1-nfasis1">
+  <w:style w:type="table" w:styleId="MediumList1-Accent1">
     <w:name w:val="Medium List 1 Accent 1"/>
-    <w:basedOn w:val="Tablanormal"/>
+    <w:basedOn w:val="TableNormal"/>
     <w:uiPriority w:val="65"/>
     <w:rsid w:val="00CB0664"/>
     <w:pPr>
@@ -6819,9 +7169,9 @@
       </w:tcPr>
     </w:tblStylePr>
   </w:style>
-  <w:style w:type="table" w:styleId="Listamedia1-nfasis2">
+  <w:style w:type="table" w:styleId="MediumList1-Accent2">
     <w:name w:val="Medium List 1 Accent 2"/>
-    <w:basedOn w:val="Tablanormal"/>
+    <w:basedOn w:val="TableNormal"/>
     <w:uiPriority w:val="65"/>
     <w:rsid w:val="00CB0664"/>
     <w:pPr>
@@ -6896,9 +7246,9 @@
       </w:tcPr>
     </w:tblStylePr>
   </w:style>
-  <w:style w:type="table" w:styleId="Listamedia1-nfasis3">
+  <w:style w:type="table" w:styleId="MediumList1-Accent3">
     <w:name w:val="Medium List 1 Accent 3"/>
-    <w:basedOn w:val="Tablanormal"/>
+    <w:basedOn w:val="TableNormal"/>
     <w:uiPriority w:val="65"/>
     <w:rsid w:val="00CB0664"/>
     <w:pPr>
@@ -6973,9 +7323,9 @@
       </w:tcPr>
     </w:tblStylePr>
   </w:style>
-  <w:style w:type="table" w:styleId="Listamedia1-nfasis4">
+  <w:style w:type="table" w:styleId="MediumList1-Accent4">
     <w:name w:val="Medium List 1 Accent 4"/>
-    <w:basedOn w:val="Tablanormal"/>
+    <w:basedOn w:val="TableNormal"/>
     <w:uiPriority w:val="65"/>
     <w:rsid w:val="00CB0664"/>
     <w:pPr>
@@ -7050,9 +7400,9 @@
       </w:tcPr>
     </w:tblStylePr>
   </w:style>
-  <w:style w:type="table" w:styleId="Listamedia1-nfasis5">
+  <w:style w:type="table" w:styleId="MediumList1-Accent5">
     <w:name w:val="Medium List 1 Accent 5"/>
-    <w:basedOn w:val="Tablanormal"/>
+    <w:basedOn w:val="TableNormal"/>
     <w:uiPriority w:val="65"/>
     <w:rsid w:val="00CB0664"/>
     <w:pPr>
@@ -7127,9 +7477,9 @@
       </w:tcPr>
     </w:tblStylePr>
   </w:style>
-  <w:style w:type="table" w:styleId="Listamedia1-nfasis6">
+  <w:style w:type="table" w:styleId="MediumList1-Accent6">
     <w:name w:val="Medium List 1 Accent 6"/>
-    <w:basedOn w:val="Tablanormal"/>
+    <w:basedOn w:val="TableNormal"/>
     <w:uiPriority w:val="65"/>
     <w:rsid w:val="00CB0664"/>
     <w:pPr>
@@ -7204,9 +7554,9 @@
       </w:tcPr>
     </w:tblStylePr>
   </w:style>
-  <w:style w:type="table" w:styleId="Listamedia2">
+  <w:style w:type="table" w:styleId="MediumList2">
     <w:name w:val="Medium List 2"/>
-    <w:basedOn w:val="Tablanormal"/>
+    <w:basedOn w:val="TableNormal"/>
     <w:uiPriority w:val="66"/>
     <w:rsid w:val="00CB0664"/>
     <w:pPr>
@@ -7325,9 +7675,9 @@
       </w:tcPr>
     </w:tblStylePr>
   </w:style>
-  <w:style w:type="table" w:styleId="Listamedia2-nfasis1">
+  <w:style w:type="table" w:styleId="MediumList2-Accent1">
     <w:name w:val="Medium List 2 Accent 1"/>
-    <w:basedOn w:val="Tablanormal"/>
+    <w:basedOn w:val="TableNormal"/>
     <w:uiPriority w:val="66"/>
     <w:rsid w:val="00CB0664"/>
     <w:pPr>
@@ -7446,9 +7796,9 @@
       </w:tcPr>
     </w:tblStylePr>
   </w:style>
-  <w:style w:type="table" w:styleId="Listamedia2-nfasis2">
+  <w:style w:type="table" w:styleId="MediumList2-Accent2">
     <w:name w:val="Medium List 2 Accent 2"/>
-    <w:basedOn w:val="Tablanormal"/>
+    <w:basedOn w:val="TableNormal"/>
     <w:uiPriority w:val="66"/>
     <w:rsid w:val="00CB0664"/>
     <w:pPr>
@@ -7567,9 +7917,9 @@
       </w:tcPr>
     </w:tblStylePr>
   </w:style>
-  <w:style w:type="table" w:styleId="Listamedia2-nfasis3">
+  <w:style w:type="table" w:styleId="MediumList2-Accent3">
     <w:name w:val="Medium List 2 Accent 3"/>
-    <w:basedOn w:val="Tablanormal"/>
+    <w:basedOn w:val="TableNormal"/>
     <w:uiPriority w:val="66"/>
     <w:rsid w:val="00CB0664"/>
     <w:pPr>
@@ -7688,9 +8038,9 @@
       </w:tcPr>
     </w:tblStylePr>
   </w:style>
-  <w:style w:type="table" w:styleId="Listamedia2-nfasis4">
+  <w:style w:type="table" w:styleId="MediumList2-Accent4">
     <w:name w:val="Medium List 2 Accent 4"/>
-    <w:basedOn w:val="Tablanormal"/>
+    <w:basedOn w:val="TableNormal"/>
     <w:uiPriority w:val="66"/>
     <w:rsid w:val="00CB0664"/>
     <w:pPr>
@@ -7809,9 +8159,9 @@
       </w:tcPr>
     </w:tblStylePr>
   </w:style>
-  <w:style w:type="table" w:styleId="Listamedia2-nfasis5">
+  <w:style w:type="table" w:styleId="MediumList2-Accent5">
     <w:name w:val="Medium List 2 Accent 5"/>
-    <w:basedOn w:val="Tablanormal"/>
+    <w:basedOn w:val="TableNormal"/>
     <w:uiPriority w:val="66"/>
     <w:rsid w:val="00CB0664"/>
     <w:pPr>
@@ -7930,9 +8280,9 @@
       </w:tcPr>
     </w:tblStylePr>
   </w:style>
-  <w:style w:type="table" w:styleId="Listamedia2-nfasis6">
+  <w:style w:type="table" w:styleId="MediumList2-Accent6">
     <w:name w:val="Medium List 2 Accent 6"/>
-    <w:basedOn w:val="Tablanormal"/>
+    <w:basedOn w:val="TableNormal"/>
     <w:uiPriority w:val="66"/>
     <w:rsid w:val="00CB0664"/>
     <w:pPr>
@@ -8051,9 +8401,9 @@
       </w:tcPr>
     </w:tblStylePr>
   </w:style>
-  <w:style w:type="table" w:styleId="Cuadrculamedia1">
+  <w:style w:type="table" w:styleId="MediumGrid1">
     <w:name w:val="Medium Grid 1"/>
-    <w:basedOn w:val="Tablanormal"/>
+    <w:basedOn w:val="TableNormal"/>
     <w:uiPriority w:val="67"/>
     <w:rsid w:val="00CB0664"/>
     <w:pPr>
@@ -8117,9 +8467,9 @@
       </w:tcPr>
     </w:tblStylePr>
   </w:style>
-  <w:style w:type="table" w:styleId="Cuadrculamedia1-nfasis1">
+  <w:style w:type="table" w:styleId="MediumGrid1-Accent1">
     <w:name w:val="Medium Grid 1 Accent 1"/>
-    <w:basedOn w:val="Tablanormal"/>
+    <w:basedOn w:val="TableNormal"/>
     <w:uiPriority w:val="67"/>
     <w:rsid w:val="00CB0664"/>
     <w:pPr>
@@ -8183,9 +8533,9 @@
       </w:tcPr>
     </w:tblStylePr>
   </w:style>
-  <w:style w:type="table" w:styleId="Cuadrculamedia1-nfasis2">
+  <w:style w:type="table" w:styleId="MediumGrid1-Accent2">
     <w:name w:val="Medium Grid 1 Accent 2"/>
-    <w:basedOn w:val="Tablanormal"/>
+    <w:basedOn w:val="TableNormal"/>
     <w:uiPriority w:val="67"/>
     <w:rsid w:val="00CB0664"/>
     <w:pPr>
@@ -8249,9 +8599,9 @@
       </w:tcPr>
     </w:tblStylePr>
   </w:style>
-  <w:style w:type="table" w:styleId="Cuadrculamedia1-nfasis3">
+  <w:style w:type="table" w:styleId="MediumGrid1-Accent3">
     <w:name w:val="Medium Grid 1 Accent 3"/>
-    <w:basedOn w:val="Tablanormal"/>
+    <w:basedOn w:val="TableNormal"/>
     <w:uiPriority w:val="67"/>
     <w:rsid w:val="00CB0664"/>
     <w:pPr>
@@ -8315,9 +8665,9 @@
       </w:tcPr>
     </w:tblStylePr>
   </w:style>
-  <w:style w:type="table" w:styleId="Cuadrculamedia1-nfasis4">
+  <w:style w:type="table" w:styleId="MediumGrid1-Accent4">
     <w:name w:val="Medium Grid 1 Accent 4"/>
-    <w:basedOn w:val="Tablanormal"/>
+    <w:basedOn w:val="TableNormal"/>
     <w:uiPriority w:val="67"/>
     <w:rsid w:val="00CB0664"/>
     <w:pPr>
@@ -8381,9 +8731,9 @@
       </w:tcPr>
     </w:tblStylePr>
   </w:style>
-  <w:style w:type="table" w:styleId="Cuadrculamedia1-nfasis5">
+  <w:style w:type="table" w:styleId="MediumGrid1-Accent5">
     <w:name w:val="Medium Grid 1 Accent 5"/>
-    <w:basedOn w:val="Tablanormal"/>
+    <w:basedOn w:val="TableNormal"/>
     <w:uiPriority w:val="67"/>
     <w:rsid w:val="00CB0664"/>
     <w:pPr>
@@ -8447,9 +8797,9 @@
       </w:tcPr>
     </w:tblStylePr>
   </w:style>
-  <w:style w:type="table" w:styleId="Cuadrculamedia1-nfasis6">
+  <w:style w:type="table" w:styleId="MediumGrid1-Accent6">
     <w:name w:val="Medium Grid 1 Accent 6"/>
-    <w:basedOn w:val="Tablanormal"/>
+    <w:basedOn w:val="TableNormal"/>
     <w:uiPriority w:val="67"/>
     <w:rsid w:val="00CB0664"/>
     <w:pPr>
@@ -8513,9 +8863,9 @@
       </w:tcPr>
     </w:tblStylePr>
   </w:style>
-  <w:style w:type="table" w:styleId="Cuadrculamedia2">
+  <w:style w:type="table" w:styleId="MediumGrid2">
     <w:name w:val="Medium Grid 2"/>
-    <w:basedOn w:val="Tablanormal"/>
+    <w:basedOn w:val="TableNormal"/>
     <w:uiPriority w:val="68"/>
     <w:rsid w:val="00CB0664"/>
     <w:pPr>
@@ -8631,9 +8981,9 @@
       </w:tcPr>
     </w:tblStylePr>
   </w:style>
-  <w:style w:type="table" w:styleId="Cuadrculamedia2-nfasis1">
+  <w:style w:type="table" w:styleId="MediumGrid2-Accent1">
     <w:name w:val="Medium Grid 2 Accent 1"/>
-    <w:basedOn w:val="Tablanormal"/>
+    <w:basedOn w:val="TableNormal"/>
     <w:uiPriority w:val="68"/>
     <w:rsid w:val="00CB0664"/>
     <w:pPr>
@@ -8749,9 +9099,9 @@
       </w:tcPr>
     </w:tblStylePr>
   </w:style>
-  <w:style w:type="table" w:styleId="Cuadrculamedia2-nfasis2">
+  <w:style w:type="table" w:styleId="MediumGrid2-Accent2">
     <w:name w:val="Medium Grid 2 Accent 2"/>
-    <w:basedOn w:val="Tablanormal"/>
+    <w:basedOn w:val="TableNormal"/>
     <w:uiPriority w:val="68"/>
     <w:rsid w:val="00CB0664"/>
     <w:pPr>
@@ -8867,9 +9217,9 @@
       </w:tcPr>
     </w:tblStylePr>
   </w:style>
-  <w:style w:type="table" w:styleId="Cuadrculamedia2-nfasis3">
+  <w:style w:type="table" w:styleId="MediumGrid2-Accent3">
     <w:name w:val="Medium Grid 2 Accent 3"/>
-    <w:basedOn w:val="Tablanormal"/>
+    <w:basedOn w:val="TableNormal"/>
     <w:uiPriority w:val="68"/>
     <w:rsid w:val="00CB0664"/>
     <w:pPr>
@@ -8985,9 +9335,9 @@
       </w:tcPr>
     </w:tblStylePr>
   </w:style>
-  <w:style w:type="table" w:styleId="Cuadrculamedia2-nfasis4">
+  <w:style w:type="table" w:styleId="MediumGrid2-Accent4">
     <w:name w:val="Medium Grid 2 Accent 4"/>
-    <w:basedOn w:val="Tablanormal"/>
+    <w:basedOn w:val="TableNormal"/>
     <w:uiPriority w:val="68"/>
     <w:rsid w:val="00CB0664"/>
     <w:pPr>
@@ -9103,9 +9453,9 @@
       </w:tcPr>
     </w:tblStylePr>
   </w:style>
-  <w:style w:type="table" w:styleId="Cuadrculamedia2-nfasis5">
+  <w:style w:type="table" w:styleId="MediumGrid2-Accent5">
     <w:name w:val="Medium Grid 2 Accent 5"/>
-    <w:basedOn w:val="Tablanormal"/>
+    <w:basedOn w:val="TableNormal"/>
     <w:uiPriority w:val="68"/>
     <w:rsid w:val="00CB0664"/>
     <w:pPr>
@@ -9221,9 +9571,9 @@
       </w:tcPr>
     </w:tblStylePr>
   </w:style>
-  <w:style w:type="table" w:styleId="Cuadrculamedia2-nfasis6">
+  <w:style w:type="table" w:styleId="MediumGrid2-Accent6">
     <w:name w:val="Medium Grid 2 Accent 6"/>
-    <w:basedOn w:val="Tablanormal"/>
+    <w:basedOn w:val="TableNormal"/>
     <w:uiPriority w:val="68"/>
     <w:rsid w:val="00CB0664"/>
     <w:pPr>
@@ -9339,9 +9689,9 @@
       </w:tcPr>
     </w:tblStylePr>
   </w:style>
-  <w:style w:type="table" w:styleId="Cuadrculamedia3">
+  <w:style w:type="table" w:styleId="MediumGrid3">
     <w:name w:val="Medium Grid 3"/>
-    <w:basedOn w:val="Tablanormal"/>
+    <w:basedOn w:val="TableNormal"/>
     <w:uiPriority w:val="69"/>
     <w:rsid w:val="00CB0664"/>
     <w:pPr>
@@ -9473,9 +9823,9 @@
       </w:tcPr>
     </w:tblStylePr>
   </w:style>
-  <w:style w:type="table" w:styleId="Cuadrculamedia3-nfasis1">
+  <w:style w:type="table" w:styleId="MediumGrid3-Accent1">
     <w:name w:val="Medium Grid 3 Accent 1"/>
-    <w:basedOn w:val="Tablanormal"/>
+    <w:basedOn w:val="TableNormal"/>
     <w:uiPriority w:val="69"/>
     <w:rsid w:val="00CB0664"/>
     <w:pPr>
@@ -9607,9 +9957,9 @@
       </w:tcPr>
     </w:tblStylePr>
   </w:style>
-  <w:style w:type="table" w:styleId="Cuadrculamedia3-nfasis2">
+  <w:style w:type="table" w:styleId="MediumGrid3-Accent2">
     <w:name w:val="Medium Grid 3 Accent 2"/>
-    <w:basedOn w:val="Tablanormal"/>
+    <w:basedOn w:val="TableNormal"/>
     <w:uiPriority w:val="69"/>
     <w:rsid w:val="00CB0664"/>
     <w:pPr>
@@ -9741,9 +10091,9 @@
       </w:tcPr>
     </w:tblStylePr>
   </w:style>
-  <w:style w:type="table" w:styleId="Cuadrculamedia3-nfasis3">
+  <w:style w:type="table" w:styleId="MediumGrid3-Accent3">
     <w:name w:val="Medium Grid 3 Accent 3"/>
-    <w:basedOn w:val="Tablanormal"/>
+    <w:basedOn w:val="TableNormal"/>
     <w:uiPriority w:val="69"/>
     <w:rsid w:val="00CB0664"/>
     <w:pPr>
@@ -9875,9 +10225,9 @@
       </w:tcPr>
     </w:tblStylePr>
   </w:style>
-  <w:style w:type="table" w:styleId="Cuadrculamedia3-nfasis4">
+  <w:style w:type="table" w:styleId="MediumGrid3-Accent4">
     <w:name w:val="Medium Grid 3 Accent 4"/>
-    <w:basedOn w:val="Tablanormal"/>
+    <w:basedOn w:val="TableNormal"/>
     <w:uiPriority w:val="69"/>
     <w:rsid w:val="00CB0664"/>
     <w:pPr>
@@ -10009,9 +10359,9 @@
       </w:tcPr>
     </w:tblStylePr>
   </w:style>
-  <w:style w:type="table" w:styleId="Cuadrculamedia3-nfasis5">
+  <w:style w:type="table" w:styleId="MediumGrid3-Accent5">
     <w:name w:val="Medium Grid 3 Accent 5"/>
-    <w:basedOn w:val="Tablanormal"/>
+    <w:basedOn w:val="TableNormal"/>
     <w:uiPriority w:val="69"/>
     <w:rsid w:val="00CB0664"/>
     <w:pPr>
@@ -10143,9 +10493,9 @@
       </w:tcPr>
     </w:tblStylePr>
   </w:style>
-  <w:style w:type="table" w:styleId="Cuadrculamedia3-nfasis6">
+  <w:style w:type="table" w:styleId="MediumGrid3-Accent6">
     <w:name w:val="Medium Grid 3 Accent 6"/>
-    <w:basedOn w:val="Tablanormal"/>
+    <w:basedOn w:val="TableNormal"/>
     <w:uiPriority w:val="69"/>
     <w:rsid w:val="00CB0664"/>
     <w:pPr>
@@ -10277,9 +10627,9 @@
       </w:tcPr>
     </w:tblStylePr>
   </w:style>
-  <w:style w:type="table" w:styleId="Listaoscura">
+  <w:style w:type="table" w:styleId="DarkList">
     <w:name w:val="Dark List"/>
-    <w:basedOn w:val="Tablanormal"/>
+    <w:basedOn w:val="TableNormal"/>
     <w:uiPriority w:val="70"/>
     <w:rsid w:val="00CB0664"/>
     <w:pPr>
@@ -10384,9 +10734,9 @@
       </w:tcPr>
     </w:tblStylePr>
   </w:style>
-  <w:style w:type="table" w:styleId="Listaoscura-nfasis1">
+  <w:style w:type="table" w:styleId="DarkList-Accent1">
     <w:name w:val="Dark List Accent 1"/>
-    <w:basedOn w:val="Tablanormal"/>
+    <w:basedOn w:val="TableNormal"/>
     <w:uiPriority w:val="70"/>
     <w:rsid w:val="00CB0664"/>
     <w:pPr>
@@ -10491,9 +10841,9 @@
       </w:tcPr>
     </w:tblStylePr>
   </w:style>
-  <w:style w:type="table" w:styleId="Listaoscura-nfasis2">
+  <w:style w:type="table" w:styleId="DarkList-Accent2">
     <w:name w:val="Dark List Accent 2"/>
-    <w:basedOn w:val="Tablanormal"/>
+    <w:basedOn w:val="TableNormal"/>
     <w:uiPriority w:val="70"/>
     <w:rsid w:val="00CB0664"/>
     <w:pPr>
@@ -10598,9 +10948,9 @@
       </w:tcPr>
     </w:tblStylePr>
   </w:style>
-  <w:style w:type="table" w:styleId="Listaoscura-nfasis3">
+  <w:style w:type="table" w:styleId="DarkList-Accent3">
     <w:name w:val="Dark List Accent 3"/>
-    <w:basedOn w:val="Tablanormal"/>
+    <w:basedOn w:val="TableNormal"/>
     <w:uiPriority w:val="70"/>
     <w:rsid w:val="00CB0664"/>
     <w:pPr>
@@ -10705,9 +11055,9 @@
       </w:tcPr>
     </w:tblStylePr>
   </w:style>
-  <w:style w:type="table" w:styleId="Listaoscura-nfasis4">
+  <w:style w:type="table" w:styleId="DarkList-Accent4">
     <w:name w:val="Dark List Accent 4"/>
-    <w:basedOn w:val="Tablanormal"/>
+    <w:basedOn w:val="TableNormal"/>
     <w:uiPriority w:val="70"/>
     <w:rsid w:val="00CB0664"/>
     <w:pPr>
@@ -10812,9 +11162,9 @@
       </w:tcPr>
     </w:tblStylePr>
   </w:style>
-  <w:style w:type="table" w:styleId="Listaoscura-nfasis5">
+  <w:style w:type="table" w:styleId="DarkList-Accent5">
     <w:name w:val="Dark List Accent 5"/>
-    <w:basedOn w:val="Tablanormal"/>
+    <w:basedOn w:val="TableNormal"/>
     <w:uiPriority w:val="70"/>
     <w:rsid w:val="00CB0664"/>
     <w:pPr>
@@ -10919,9 +11269,9 @@
       </w:tcPr>
     </w:tblStylePr>
   </w:style>
-  <w:style w:type="table" w:styleId="Listaoscura-nfasis6">
+  <w:style w:type="table" w:styleId="DarkList-Accent6">
     <w:name w:val="Dark List Accent 6"/>
-    <w:basedOn w:val="Tablanormal"/>
+    <w:basedOn w:val="TableNormal"/>
     <w:uiPriority w:val="70"/>
     <w:rsid w:val="00CB0664"/>
     <w:pPr>
@@ -11026,9 +11376,9 @@
       </w:tcPr>
     </w:tblStylePr>
   </w:style>
-  <w:style w:type="table" w:styleId="Sombreadovistoso">
+  <w:style w:type="table" w:styleId="ColorfulShading">
     <w:name w:val="Colorful Shading"/>
-    <w:basedOn w:val="Tablanormal"/>
+    <w:basedOn w:val="TableNormal"/>
     <w:uiPriority w:val="71"/>
     <w:rsid w:val="00CB0664"/>
     <w:pPr>
@@ -11141,9 +11491,9 @@
       </w:rPr>
     </w:tblStylePr>
   </w:style>
-  <w:style w:type="table" w:styleId="Sombreadovistoso-nfasis1">
+  <w:style w:type="table" w:styleId="ColorfulShading-Accent1">
     <w:name w:val="Colorful Shading Accent 1"/>
-    <w:basedOn w:val="Tablanormal"/>
+    <w:basedOn w:val="TableNormal"/>
     <w:uiPriority w:val="71"/>
     <w:rsid w:val="00CB0664"/>
     <w:pPr>
@@ -11256,9 +11606,9 @@
       </w:rPr>
     </w:tblStylePr>
   </w:style>
-  <w:style w:type="table" w:styleId="Sombreadovistoso-nfasis2">
+  <w:style w:type="table" w:styleId="ColorfulShading-Accent2">
     <w:name w:val="Colorful Shading Accent 2"/>
-    <w:basedOn w:val="Tablanormal"/>
+    <w:basedOn w:val="TableNormal"/>
     <w:uiPriority w:val="71"/>
     <w:rsid w:val="00CB0664"/>
     <w:pPr>
@@ -11371,9 +11721,9 @@
       </w:rPr>
     </w:tblStylePr>
   </w:style>
-  <w:style w:type="table" w:styleId="Sombreadovistoso-nfasis3">
+  <w:style w:type="table" w:styleId="ColorfulShading-Accent3">
     <w:name w:val="Colorful Shading Accent 3"/>
-    <w:basedOn w:val="Tablanormal"/>
+    <w:basedOn w:val="TableNormal"/>
     <w:uiPriority w:val="71"/>
     <w:rsid w:val="00CB0664"/>
     <w:pPr>
@@ -11476,9 +11826,9 @@
       </w:tcPr>
     </w:tblStylePr>
   </w:style>
-  <w:style w:type="table" w:styleId="Sombreadovistoso-nfasis4">
+  <w:style w:type="table" w:styleId="ColorfulShading-Accent4">
     <w:name w:val="Colorful Shading Accent 4"/>
-    <w:basedOn w:val="Tablanormal"/>
+    <w:basedOn w:val="TableNormal"/>
     <w:uiPriority w:val="71"/>
     <w:rsid w:val="00CB0664"/>
     <w:pPr>
@@ -11591,9 +11941,9 @@
       </w:rPr>
     </w:tblStylePr>
   </w:style>
-  <w:style w:type="table" w:styleId="Sombreadovistoso-nfasis5">
+  <w:style w:type="table" w:styleId="ColorfulShading-Accent5">
     <w:name w:val="Colorful Shading Accent 5"/>
-    <w:basedOn w:val="Tablanormal"/>
+    <w:basedOn w:val="TableNormal"/>
     <w:uiPriority w:val="71"/>
     <w:rsid w:val="00CB0664"/>
     <w:pPr>
@@ -11706,9 +12056,9 @@
       </w:rPr>
     </w:tblStylePr>
   </w:style>
-  <w:style w:type="table" w:styleId="Sombreadovistoso-nfasis6">
+  <w:style w:type="table" w:styleId="ColorfulShading-Accent6">
     <w:name w:val="Colorful Shading Accent 6"/>
-    <w:basedOn w:val="Tablanormal"/>
+    <w:basedOn w:val="TableNormal"/>
     <w:uiPriority w:val="71"/>
     <w:rsid w:val="00CB0664"/>
     <w:pPr>
@@ -11821,9 +12171,9 @@
       </w:rPr>
     </w:tblStylePr>
   </w:style>
-  <w:style w:type="table" w:styleId="Listavistosa">
+  <w:style w:type="table" w:styleId="ColorfulList">
     <w:name w:val="Colorful List"/>
-    <w:basedOn w:val="Tablanormal"/>
+    <w:basedOn w:val="TableNormal"/>
     <w:uiPriority w:val="72"/>
     <w:rsid w:val="00CB0664"/>
     <w:pPr>
@@ -11900,9 +12250,9 @@
       </w:tcPr>
     </w:tblStylePr>
   </w:style>
-  <w:style w:type="table" w:styleId="Listavistosa-nfasis1">
+  <w:style w:type="table" w:styleId="ColorfulList-Accent1">
     <w:name w:val="Colorful List Accent 1"/>
-    <w:basedOn w:val="Tablanormal"/>
+    <w:basedOn w:val="TableNormal"/>
     <w:uiPriority w:val="72"/>
     <w:rsid w:val="00CB0664"/>
     <w:pPr>
@@ -11979,9 +12329,9 @@
       </w:tcPr>
     </w:tblStylePr>
   </w:style>
-  <w:style w:type="table" w:styleId="Listavistosa-nfasis2">
+  <w:style w:type="table" w:styleId="ColorfulList-Accent2">
     <w:name w:val="Colorful List Accent 2"/>
-    <w:basedOn w:val="Tablanormal"/>
+    <w:basedOn w:val="TableNormal"/>
     <w:uiPriority w:val="72"/>
     <w:rsid w:val="00CB0664"/>
     <w:pPr>
@@ -12058,9 +12408,9 @@
       </w:tcPr>
     </w:tblStylePr>
   </w:style>
-  <w:style w:type="table" w:styleId="Listavistosa-nfasis3">
+  <w:style w:type="table" w:styleId="ColorfulList-Accent3">
     <w:name w:val="Colorful List Accent 3"/>
-    <w:basedOn w:val="Tablanormal"/>
+    <w:basedOn w:val="TableNormal"/>
     <w:uiPriority w:val="72"/>
     <w:rsid w:val="00CB0664"/>
     <w:pPr>
@@ -12137,9 +12487,9 @@
       </w:tcPr>
     </w:tblStylePr>
   </w:style>
-  <w:style w:type="table" w:styleId="Listavistosa-nfasis4">
+  <w:style w:type="table" w:styleId="ColorfulList-Accent4">
     <w:name w:val="Colorful List Accent 4"/>
-    <w:basedOn w:val="Tablanormal"/>
+    <w:basedOn w:val="TableNormal"/>
     <w:uiPriority w:val="72"/>
     <w:rsid w:val="00CB0664"/>
     <w:pPr>
@@ -12216,9 +12566,9 @@
       </w:tcPr>
     </w:tblStylePr>
   </w:style>
-  <w:style w:type="table" w:styleId="Listavistosa-nfasis5">
+  <w:style w:type="table" w:styleId="ColorfulList-Accent5">
     <w:name w:val="Colorful List Accent 5"/>
-    <w:basedOn w:val="Tablanormal"/>
+    <w:basedOn w:val="TableNormal"/>
     <w:uiPriority w:val="72"/>
     <w:rsid w:val="00CB0664"/>
     <w:pPr>
@@ -12295,9 +12645,9 @@
       </w:tcPr>
     </w:tblStylePr>
   </w:style>
-  <w:style w:type="table" w:styleId="Listavistosa-nfasis6">
+  <w:style w:type="table" w:styleId="ColorfulList-Accent6">
     <w:name w:val="Colorful List Accent 6"/>
-    <w:basedOn w:val="Tablanormal"/>
+    <w:basedOn w:val="TableNormal"/>
     <w:uiPriority w:val="72"/>
     <w:rsid w:val="00CB0664"/>
     <w:pPr>
@@ -12374,9 +12724,9 @@
       </w:tcPr>
     </w:tblStylePr>
   </w:style>
-  <w:style w:type="table" w:styleId="Cuadrculavistosa">
+  <w:style w:type="table" w:styleId="ColorfulGrid">
     <w:name w:val="Colorful Grid"/>
-    <w:basedOn w:val="Tablanormal"/>
+    <w:basedOn w:val="TableNormal"/>
     <w:uiPriority w:val="73"/>
     <w:rsid w:val="00CB0664"/>
     <w:pPr>
@@ -12447,9 +12797,9 @@
       </w:tcPr>
     </w:tblStylePr>
   </w:style>
-  <w:style w:type="table" w:styleId="Cuadrculavistosa-nfasis1">
+  <w:style w:type="table" w:styleId="ColorfulGrid-Accent1">
     <w:name w:val="Colorful Grid Accent 1"/>
-    <w:basedOn w:val="Tablanormal"/>
+    <w:basedOn w:val="TableNormal"/>
     <w:uiPriority w:val="73"/>
     <w:rsid w:val="00CB0664"/>
     <w:pPr>
@@ -12520,9 +12870,9 @@
       </w:tcPr>
     </w:tblStylePr>
   </w:style>
-  <w:style w:type="table" w:styleId="Cuadrculavistosa-nfasis2">
+  <w:style w:type="table" w:styleId="ColorfulGrid-Accent2">
     <w:name w:val="Colorful Grid Accent 2"/>
-    <w:basedOn w:val="Tablanormal"/>
+    <w:basedOn w:val="TableNormal"/>
     <w:uiPriority w:val="73"/>
     <w:rsid w:val="00CB0664"/>
     <w:pPr>
@@ -12593,9 +12943,9 @@
       </w:tcPr>
     </w:tblStylePr>
   </w:style>
-  <w:style w:type="table" w:styleId="Cuadrculavistosa-nfasis3">
+  <w:style w:type="table" w:styleId="ColorfulGrid-Accent3">
     <w:name w:val="Colorful Grid Accent 3"/>
-    <w:basedOn w:val="Tablanormal"/>
+    <w:basedOn w:val="TableNormal"/>
     <w:uiPriority w:val="73"/>
     <w:rsid w:val="00CB0664"/>
     <w:pPr>
@@ -12666,9 +13016,9 @@
       </w:tcPr>
     </w:tblStylePr>
   </w:style>
-  <w:style w:type="table" w:styleId="Cuadrculavistosa-nfasis4">
+  <w:style w:type="table" w:styleId="ColorfulGrid-Accent4">
     <w:name w:val="Colorful Grid Accent 4"/>
-    <w:basedOn w:val="Tablanormal"/>
+    <w:basedOn w:val="TableNormal"/>
     <w:uiPriority w:val="73"/>
     <w:rsid w:val="00CB0664"/>
     <w:pPr>
@@ -12739,9 +13089,9 @@
       </w:tcPr>
     </w:tblStylePr>
   </w:style>
-  <w:style w:type="table" w:styleId="Cuadrculavistosa-nfasis5">
+  <w:style w:type="table" w:styleId="ColorfulGrid-Accent5">
     <w:name w:val="Colorful Grid Accent 5"/>
-    <w:basedOn w:val="Tablanormal"/>
+    <w:basedOn w:val="TableNormal"/>
     <w:uiPriority w:val="73"/>
     <w:rsid w:val="00CB0664"/>
     <w:pPr>
@@ -12812,9 +13162,9 @@
       </w:tcPr>
     </w:tblStylePr>
   </w:style>
-  <w:style w:type="table" w:styleId="Cuadrculavistosa-nfasis6">
+  <w:style w:type="table" w:styleId="ColorfulGrid-Accent6">
     <w:name w:val="Colorful Grid Accent 6"/>
-    <w:basedOn w:val="Tablanormal"/>
+    <w:basedOn w:val="TableNormal"/>
     <w:uiPriority w:val="73"/>
     <w:rsid w:val="00CB0664"/>
     <w:pPr>

</xml_diff>